<commit_message>
Refine results with corrected contrast and coverage analysis
- Report contrast on a 10log10 intensity scale and fix the focused receive aperture
- Add per-point PSF map and field-coverage analysis (F5, F14)
- Remove speckle statistics; renumber F13 as point-target validation
- Split discussion/appendix into a companion report and update README, tables, figures
- Ignore debug figures and runtime logs
</commit_message>
<xml_diff>
--- a/docs/项目介绍.docx
+++ b/docs/项目介绍.docx
@@ -2,32 +2,6 @@
 <file path=word/document.xml><?xml version="1.0" encoding="utf-8"?>
 <w:document xmlns:w="http://schemas.openxmlformats.org/wordprocessingml/2006/main" xmlns:m="http://schemas.openxmlformats.org/officeDocument/2006/math" xmlns:r="http://schemas.openxmlformats.org/officeDocument/2006/relationships" xmlns:o="urn:schemas-microsoft-com:office:office" xmlns:v="urn:schemas-microsoft-com:vml" xmlns:w10="urn:schemas-microsoft-com:office:word" xmlns:a="http://schemas.openxmlformats.org/drawingml/2006/main" xmlns:pic="http://schemas.openxmlformats.org/drawingml/2006/picture" xmlns:wp="http://schemas.openxmlformats.org/drawingml/2006/wordprocessingDrawing">
   <w:body>
-    <w:sdt>
-      <w:sdtPr>
-        <w:docPartObj>
-          <w:docPartGallery w:val="Table of Contents"/>
-          <w:docPartUnique/>
-        </w:docPartObj>
-      </w:sdtPr>
-      <w:sdtContent>
-        <w:p>
-          <w:pPr>
-            <w:pStyle w:val="TOCHeading"/>
-          </w:pPr>
-          <w:r>
-            <w:t xml:space="preserve">Table of Contents</w:t>
-          </w:r>
-        </w:p>
-        <w:p>
-          <w:r>
-            <w:fldChar w:fldCharType="begin" w:dirty="true"/>
-            <w:instrText xml:space="preserve">TOC \o "1-2" \h \z \u</w:instrText>
-            <w:fldChar w:fldCharType="separate"/>
-            <w:fldChar w:fldCharType="end"/>
-          </w:r>
-        </w:p>
-      </w:sdtContent>
-    </w:sdt>
     <w:bookmarkStart w:id="28" w:name="项目导读从零读懂这套超快超声仿真"/>
     <w:p>
       <w:pPr>
@@ -427,13 +401,22 @@
         <w:t xml:space="preserve">结论在报告里：囊肿对比度</w:t>
       </w:r>
       <w:r>
-        <w:t xml:space="preserve"> 25.2 → 45.2 </w:t>
-      </w:r>
-      <w:r>
-        <w:rPr>
-          <w:rFonts w:hint="eastAsia"/>
-        </w:rPr>
-        <w:t xml:space="preserve">dB、横向</w:t>
+        <w:t xml:space="preserve"> 12.8 → 23.3 </w:t>
+      </w:r>
+      <w:r>
+        <w:rPr>
+          <w:rFonts w:hint="eastAsia"/>
+        </w:rPr>
+        <w:t xml:space="preserve">dB（强度</w:t>
+      </w:r>
+      <w:r>
+        <w:t xml:space="preserve"> </w:t>
+      </w:r>
+      <w:r>
+        <w:rPr>
+          <w:rFonts w:hint="eastAsia"/>
+        </w:rPr>
+        <w:t xml:space="preserve">dB，10log₁₀）、横向</w:t>
       </w:r>
       <w:r>
         <w:t xml:space="preserve"> −10 dB </w:t>
@@ -445,7 +428,7 @@
         <w:t xml:space="preserve">宽度</w:t>
       </w:r>
       <w:r>
-        <w:t xml:space="preserve"> 1.00 → 0.92 mm、30 mm </w:t>
+        <w:t xml:space="preserve"> 1.06 → 0.99 mm、30 mm </w:t>
       </w:r>
       <w:r>
         <w:rPr>
@@ -570,20 +553,46 @@
           <w:rStyle w:val="VerbatimChar"/>
           <w:rFonts w:hint="eastAsia"/>
         </w:rPr>
-        <w:t xml:space="preserve">第一次跑：完整核心实验（约</w:t>
-      </w:r>
-      <w:r>
-        <w:rPr>
-          <w:rStyle w:val="VerbatimChar"/>
-        </w:rPr>
-        <w:t xml:space="preserve"> 45 </w:t>
-      </w:r>
-      <w:r>
-        <w:rPr>
-          <w:rStyle w:val="VerbatimChar"/>
-          <w:rFonts w:hint="eastAsia"/>
-        </w:rPr>
-        <w:t xml:space="preserve">分钟）</w:t>
+        <w:t xml:space="preserve">第一次跑：完整核心实验（冷启动约</w:t>
+      </w:r>
+      <w:r>
+        <w:rPr>
+          <w:rStyle w:val="VerbatimChar"/>
+        </w:rPr>
+        <w:t xml:space="preserve"> 50 </w:t>
+      </w:r>
+      <w:r>
+        <w:rPr>
+          <w:rStyle w:val="VerbatimChar"/>
+          <w:rFonts w:hint="eastAsia"/>
+        </w:rPr>
+        <w:t xml:space="preserve">分钟，负载重时</w:t>
+      </w:r>
+      <w:r>
+        <w:rPr>
+          <w:rStyle w:val="VerbatimChar"/>
+        </w:rPr>
+        <w:t xml:space="preserve"> ~95 </w:t>
+      </w:r>
+      <w:r>
+        <w:rPr>
+          <w:rStyle w:val="VerbatimChar"/>
+          <w:rFonts w:hint="eastAsia"/>
+        </w:rPr>
+        <w:t xml:space="preserve">分钟；数据已在时约</w:t>
+      </w:r>
+      <w:r>
+        <w:rPr>
+          <w:rStyle w:val="VerbatimChar"/>
+        </w:rPr>
+        <w:t xml:space="preserve"> 10 </w:t>
+      </w:r>
+      <w:r>
+        <w:rPr>
+          <w:rStyle w:val="VerbatimChar"/>
+          <w:rFonts w:hint="eastAsia"/>
+        </w:rPr>
+        <w:t xml:space="preserve">秒）</w:t>
       </w:r>
       <w:r>
         <w:br/>
@@ -707,7 +716,7 @@
         <w:rPr>
           <w:rStyle w:val="VerbatimChar"/>
         </w:rPr>
-        <w:t xml:space="preserve"> 6 </w:t>
+        <w:t xml:space="preserve"> 5 </w:t>
       </w:r>
       <w:r>
         <w:rPr>
@@ -869,7 +878,7 @@
           <w:rStyle w:val="VerbatimChar"/>
           <w:rFonts w:hint="eastAsia"/>
         </w:rPr>
-        <w:t xml:space="preserve">装脉冲</w:t>
+        <w:t xml:space="preserve">装脉冲；第二个输出是接收句柄</w:t>
       </w:r>
       <w:r>
         <w:br/>
@@ -878,6 +887,48 @@
         <w:rPr>
           <w:rStyle w:val="VerbatimChar"/>
         </w:rPr>
+        <w:t xml:space="preserve">│  ├─ pulse_waveform.m         </w:t>
+      </w:r>
+      <w:r>
+        <w:rPr>
+          <w:rStyle w:val="VerbatimChar"/>
+          <w:rFonts w:hint="eastAsia"/>
+        </w:rPr>
+        <w:t xml:space="preserve">发射脉冲（高斯包络正弦）的唯一定义，f2_setup</w:t>
+      </w:r>
+      <w:r>
+        <w:rPr>
+          <w:rStyle w:val="VerbatimChar"/>
+        </w:rPr>
+        <w:t xml:space="preserve"> </w:t>
+      </w:r>
+      <w:r>
+        <w:rPr>
+          <w:rStyle w:val="VerbatimChar"/>
+          <w:rFonts w:hint="eastAsia"/>
+        </w:rPr>
+        <w:t xml:space="preserve">与图</w:t>
+      </w:r>
+      <w:r>
+        <w:rPr>
+          <w:rStyle w:val="VerbatimChar"/>
+        </w:rPr>
+        <w:t xml:space="preserve"> F2 </w:t>
+      </w:r>
+      <w:r>
+        <w:rPr>
+          <w:rStyle w:val="VerbatimChar"/>
+          <w:rFonts w:hint="eastAsia"/>
+        </w:rPr>
+        <w:t xml:space="preserve">共用</w:t>
+      </w:r>
+      <w:r>
+        <w:br/>
+      </w:r>
+      <w:r>
+        <w:rPr>
+          <w:rStyle w:val="VerbatimChar"/>
+        </w:rPr>
         <w:t xml:space="preserve">│  ├─ acquire_pw.m             </w:t>
       </w:r>
       <w:r>
@@ -898,7 +949,7 @@
           <w:rStyle w:val="VerbatimChar"/>
           <w:rFonts w:hint="eastAsia"/>
         </w:rPr>
-        <w:t xml:space="preserve">通道数据</w:t>
+        <w:t xml:space="preserve">通道数据（发射/接收两个句柄）</w:t>
       </w:r>
       <w:r>
         <w:br/>
@@ -927,7 +978,7 @@
           <w:rStyle w:val="VerbatimChar"/>
           <w:rFonts w:hint="eastAsia"/>
         </w:rPr>
-        <w:t xml:space="preserve">通道数据</w:t>
+        <w:t xml:space="preserve">通道数据（接收不被发射窗加权）</w:t>
       </w:r>
       <w:r>
         <w:br/>
@@ -1291,7 +1342,330 @@
           <w:rStyle w:val="VerbatimChar"/>
           <w:rFonts w:hint="eastAsia"/>
         </w:rPr>
-        <w:t xml:space="preserve">各角度发射声场</w:t>
+        <w:t xml:space="preserve">各角度的发射峰值声压</w:t>
+      </w:r>
+      <w:r>
+        <w:br/>
+      </w:r>
+      <w:r>
+        <w:rPr>
+          <w:rStyle w:val="VerbatimChar"/>
+        </w:rPr>
+        <w:t xml:space="preserve">│  ├─ psf_map.m                </w:t>
+      </w:r>
+      <w:r>
+        <w:rPr>
+          <w:rStyle w:val="VerbatimChar"/>
+          <w:rFonts w:hint="eastAsia"/>
+        </w:rPr>
+        <w:t xml:space="preserve">成像区域逐点放散射子，走完整链路量幅度/宽度</w:t>
+      </w:r>
+      <w:r>
+        <w:br/>
+      </w:r>
+      <w:r>
+        <w:rPr>
+          <w:rStyle w:val="VerbatimChar"/>
+        </w:rPr>
+        <w:t xml:space="preserve">│  ├─ stage_analysis.m         </w:t>
+      </w:r>
+      <w:r>
+        <w:rPr>
+          <w:rStyle w:val="VerbatimChar"/>
+          <w:rFonts w:hint="eastAsia"/>
+        </w:rPr>
+        <w:t xml:space="preserve">复合、算指标、写</w:t>
+      </w:r>
+      <w:r>
+        <w:rPr>
+          <w:rStyle w:val="VerbatimChar"/>
+        </w:rPr>
+        <w:t xml:space="preserve"> results.mat </w:t>
+      </w:r>
+      <w:r>
+        <w:rPr>
+          <w:rStyle w:val="VerbatimChar"/>
+          <w:rFonts w:hint="eastAsia"/>
+        </w:rPr>
+        <w:t xml:space="preserve">与</w:t>
+      </w:r>
+      <w:r>
+        <w:rPr>
+          <w:rStyle w:val="VerbatimChar"/>
+        </w:rPr>
+        <w:t xml:space="preserve"> CSV</w:t>
+      </w:r>
+      <w:r>
+        <w:br/>
+      </w:r>
+      <w:r>
+        <w:rPr>
+          <w:rStyle w:val="VerbatimChar"/>
+        </w:rPr>
+        <w:t xml:space="preserve">│  ├─ subset_indices.m         </w:t>
+      </w:r>
+      <w:r>
+        <w:rPr>
+          <w:rStyle w:val="VerbatimChar"/>
+          <w:rFonts w:hint="eastAsia"/>
+        </w:rPr>
+        <w:t xml:space="preserve">两种方法（PW</w:t>
+      </w:r>
+      <w:r>
+        <w:rPr>
+          <w:rStyle w:val="VerbatimChar"/>
+        </w:rPr>
+        <w:t xml:space="preserve"> / </w:t>
+      </w:r>
+      <w:r>
+        <w:rPr>
+          <w:rStyle w:val="VerbatimChar"/>
+          <w:rFonts w:hint="eastAsia"/>
+        </w:rPr>
+        <w:t xml:space="preserve">C11）各自的角度下标</w:t>
+      </w:r>
+      <w:r>
+        <w:br/>
+      </w:r>
+      <w:r>
+        <w:rPr>
+          <w:rStyle w:val="VerbatimChar"/>
+        </w:rPr>
+        <w:t xml:space="preserve">│  ├─ pulse_stats.m            </w:t>
+      </w:r>
+      <w:r>
+        <w:rPr>
+          <w:rStyle w:val="VerbatimChar"/>
+          <w:rFonts w:hint="eastAsia"/>
+        </w:rPr>
+        <w:t xml:space="preserve">测中心频率与带宽（E0</w:t>
+      </w:r>
+      <w:r>
+        <w:rPr>
+          <w:rStyle w:val="VerbatimChar"/>
+        </w:rPr>
+        <w:t xml:space="preserve"> </w:t>
+      </w:r>
+      <w:r>
+        <w:rPr>
+          <w:rStyle w:val="VerbatimChar"/>
+          <w:rFonts w:hint="eastAsia"/>
+        </w:rPr>
+        <w:t xml:space="preserve">的两程数据、图</w:t>
+      </w:r>
+      <w:r>
+        <w:rPr>
+          <w:rStyle w:val="VerbatimChar"/>
+        </w:rPr>
+        <w:t xml:space="preserve"> F2 </w:t>
+      </w:r>
+      <w:r>
+        <w:rPr>
+          <w:rStyle w:val="VerbatimChar"/>
+          <w:rFonts w:hint="eastAsia"/>
+        </w:rPr>
+        <w:t xml:space="preserve">的理想脉冲共用）</w:t>
+      </w:r>
+      <w:r>
+        <w:br/>
+      </w:r>
+      <w:r>
+        <w:rPr>
+          <w:rStyle w:val="VerbatimChar"/>
+        </w:rPr>
+        <w:t xml:space="preserve">│  ├─ metrics_resolution.m     </w:t>
+      </w:r>
+      <w:r>
+        <w:rPr>
+          <w:rStyle w:val="VerbatimChar"/>
+          <w:rFonts w:hint="eastAsia"/>
+        </w:rPr>
+        <w:t xml:space="preserve">点目标</w:t>
+      </w:r>
+      <w:r>
+        <w:rPr>
+          <w:rStyle w:val="VerbatimChar"/>
+        </w:rPr>
+        <w:t xml:space="preserve"> -10 dB </w:t>
+      </w:r>
+      <w:r>
+        <w:rPr>
+          <w:rStyle w:val="VerbatimChar"/>
+          <w:rFonts w:hint="eastAsia"/>
+        </w:rPr>
+        <w:t xml:space="preserve">横向</w:t>
+      </w:r>
+      <w:r>
+        <w:rPr>
+          <w:rStyle w:val="VerbatimChar"/>
+        </w:rPr>
+        <w:t xml:space="preserve"> / -6 dB </w:t>
+      </w:r>
+      <w:r>
+        <w:rPr>
+          <w:rStyle w:val="VerbatimChar"/>
+          <w:rFonts w:hint="eastAsia"/>
+        </w:rPr>
+        <w:t xml:space="preserve">轴向宽度</w:t>
+      </w:r>
+      <w:r>
+        <w:br/>
+      </w:r>
+      <w:r>
+        <w:rPr>
+          <w:rStyle w:val="VerbatimChar"/>
+        </w:rPr>
+        <w:t xml:space="preserve">│  ├─ metrics_contrast.m       </w:t>
+      </w:r>
+      <w:r>
+        <w:rPr>
+          <w:rStyle w:val="VerbatimChar"/>
+          <w:rFonts w:hint="eastAsia"/>
+        </w:rPr>
+        <w:t xml:space="preserve">囊肿对比度与</w:t>
+      </w:r>
+      <w:r>
+        <w:rPr>
+          <w:rStyle w:val="VerbatimChar"/>
+        </w:rPr>
+        <w:t xml:space="preserve"> CNR</w:t>
+      </w:r>
+      <w:r>
+        <w:br/>
+      </w:r>
+      <w:r>
+        <w:rPr>
+          <w:rStyle w:val="VerbatimChar"/>
+        </w:rPr>
+        <w:t xml:space="preserve">│  ├─ crossing_width.m         </w:t>
+      </w:r>
+      <w:r>
+        <w:rPr>
+          <w:rStyle w:val="VerbatimChar"/>
+          <w:rFonts w:hint="eastAsia"/>
+        </w:rPr>
+        <w:t xml:space="preserve">曲线在指定电平处的宽度（线性插值）</w:t>
+      </w:r>
+      <w:r>
+        <w:br/>
+      </w:r>
+      <w:r>
+        <w:rPr>
+          <w:rStyle w:val="VerbatimChar"/>
+        </w:rPr>
+        <w:t xml:space="preserve">│  ├─ peak_pos.m               </w:t>
+      </w:r>
+      <w:r>
+        <w:rPr>
+          <w:rStyle w:val="VerbatimChar"/>
+          <w:rFonts w:hint="eastAsia"/>
+        </w:rPr>
+        <w:t xml:space="preserve">点目标轴向位置（强度质心，抗旁瓣跳变）</w:t>
+      </w:r>
+      <w:r>
+        <w:br/>
+      </w:r>
+      <w:r>
+        <w:rPr>
+          <w:rStyle w:val="VerbatimChar"/>
+        </w:rPr>
+        <w:t xml:space="preserve">│  ├─ to_db.m                  </w:t>
+      </w:r>
+      <w:r>
+        <w:rPr>
+          <w:rStyle w:val="VerbatimChar"/>
+          <w:rFonts w:hint="eastAsia"/>
+        </w:rPr>
+        <w:t xml:space="preserve">包络</w:t>
+      </w:r>
+      <w:r>
+        <w:rPr>
+          <w:rStyle w:val="VerbatimChar"/>
+        </w:rPr>
+        <w:t xml:space="preserve"> → dB </w:t>
+      </w:r>
+      <w:r>
+        <w:rPr>
+          <w:rStyle w:val="VerbatimChar"/>
+          <w:rFonts w:hint="eastAsia"/>
+        </w:rPr>
+        <w:t xml:space="preserve">图（截断显示动态范围）</w:t>
+      </w:r>
+      <w:r>
+        <w:br/>
+      </w:r>
+      <w:r>
+        <w:rPr>
+          <w:rStyle w:val="VerbatimChar"/>
+        </w:rPr>
+        <w:t xml:space="preserve">│  └─ save_fig.m               </w:t>
+      </w:r>
+      <w:r>
+        <w:rPr>
+          <w:rStyle w:val="VerbatimChar"/>
+          <w:rFonts w:hint="eastAsia"/>
+        </w:rPr>
+        <w:t xml:space="preserve">图窗</w:t>
+      </w:r>
+      <w:r>
+        <w:rPr>
+          <w:rStyle w:val="VerbatimChar"/>
+        </w:rPr>
+        <w:t xml:space="preserve"> → PNG</w:t>
+      </w:r>
+      <w:r>
+        <w:br/>
+      </w:r>
+      <w:r>
+        <w:rPr>
+          <w:rStyle w:val="VerbatimChar"/>
+        </w:rPr>
+        <w:t xml:space="preserve">├─ run/                        </w:t>
+      </w:r>
+      <w:r>
+        <w:rPr>
+          <w:rStyle w:val="VerbatimChar"/>
+          <w:rFonts w:hint="eastAsia"/>
+        </w:rPr>
+        <w:t xml:space="preserve">入口脚本</w:t>
+      </w:r>
+      <w:r>
+        <w:br/>
+      </w:r>
+      <w:r>
+        <w:rPr>
+          <w:rStyle w:val="VerbatimChar"/>
+        </w:rPr>
+        <w:t xml:space="preserve">│  ├─ run_core.m               </w:t>
+      </w:r>
+      <w:r>
+        <w:rPr>
+          <w:rStyle w:val="VerbatimChar"/>
+          <w:rFonts w:hint="eastAsia"/>
+        </w:rPr>
+        <w:t xml:space="preserve">主流程</w:t>
+      </w:r>
+      <w:r>
+        <w:rPr>
+          <w:rStyle w:val="VerbatimChar"/>
+        </w:rPr>
+        <w:t xml:space="preserve"> E0–E4</w:t>
+      </w:r>
+      <w:r>
+        <w:br/>
+      </w:r>
+      <w:r>
+        <w:rPr>
+          <w:rStyle w:val="VerbatimChar"/>
+        </w:rPr>
+        <w:t xml:space="preserve">│  ├─ run_tail.m               P1 </w:t>
+      </w:r>
+      <w:r>
+        <w:rPr>
+          <w:rStyle w:val="VerbatimChar"/>
+          <w:rFonts w:hint="eastAsia"/>
+        </w:rPr>
+        <w:t xml:space="preserve">之后的收尾（囊肿体模</w:t>
       </w:r>
       <w:r>
         <w:rPr>
@@ -1304,7 +1678,33 @@
           <w:rStyle w:val="VerbatimChar"/>
           <w:rFonts w:hint="eastAsia"/>
         </w:rPr>
-        <w:t xml:space="preserve">合成声场</w:t>
+        <w:t xml:space="preserve">噪声</w:t>
+      </w:r>
+      <w:r>
+        <w:rPr>
+          <w:rStyle w:val="VerbatimChar"/>
+        </w:rPr>
+        <w:t xml:space="preserve"> + </w:t>
+      </w:r>
+      <w:r>
+        <w:rPr>
+          <w:rStyle w:val="VerbatimChar"/>
+          <w:rFonts w:hint="eastAsia"/>
+        </w:rPr>
+        <w:t xml:space="preserve">分析</w:t>
+      </w:r>
+      <w:r>
+        <w:rPr>
+          <w:rStyle w:val="VerbatimChar"/>
+        </w:rPr>
+        <w:t xml:space="preserve"> + </w:t>
+      </w:r>
+      <w:r>
+        <w:rPr>
+          <w:rStyle w:val="VerbatimChar"/>
+          <w:rFonts w:hint="eastAsia"/>
+        </w:rPr>
+        <w:t xml:space="preserve">出图）</w:t>
       </w:r>
       <w:r>
         <w:br/>
@@ -1313,33 +1713,14 @@
         <w:rPr>
           <w:rStyle w:val="VerbatimChar"/>
         </w:rPr>
-        <w:t xml:space="preserve">│  ├─ stage_analysis.m         </w:t>
-      </w:r>
-      <w:r>
-        <w:rPr>
-          <w:rStyle w:val="VerbatimChar"/>
-          <w:rFonts w:hint="eastAsia"/>
-        </w:rPr>
-        <w:t xml:space="preserve">复合、算指标、写</w:t>
-      </w:r>
-      <w:r>
-        <w:rPr>
-          <w:rStyle w:val="VerbatimChar"/>
-        </w:rPr>
-        <w:t xml:space="preserve"> results.mat </w:t>
-      </w:r>
-      <w:r>
-        <w:rPr>
-          <w:rStyle w:val="VerbatimChar"/>
-          <w:rFonts w:hint="eastAsia"/>
-        </w:rPr>
-        <w:t xml:space="preserve">与</w:t>
-      </w:r>
-      <w:r>
-        <w:rPr>
-          <w:rStyle w:val="VerbatimChar"/>
-        </w:rPr>
-        <w:t xml:space="preserve"> CSV</w:t>
+        <w:t xml:space="preserve">│  ├─ run_refresh.m            </w:t>
+      </w:r>
+      <w:r>
+        <w:rPr>
+          <w:rStyle w:val="VerbatimChar"/>
+          <w:rFonts w:hint="eastAsia"/>
+        </w:rPr>
+        <w:t xml:space="preserve">只重算声场/指标/图/表</w:t>
       </w:r>
       <w:r>
         <w:br/>
@@ -1348,27 +1729,40 @@
         <w:rPr>
           <w:rStyle w:val="VerbatimChar"/>
         </w:rPr>
-        <w:t xml:space="preserve">│  ├─ subset_indices.m         </w:t>
-      </w:r>
-      <w:r>
-        <w:rPr>
-          <w:rStyle w:val="VerbatimChar"/>
-          <w:rFonts w:hint="eastAsia"/>
-        </w:rPr>
-        <w:t xml:space="preserve">两种方法（PW</w:t>
-      </w:r>
-      <w:r>
-        <w:rPr>
-          <w:rStyle w:val="VerbatimChar"/>
-        </w:rPr>
-        <w:t xml:space="preserve"> / </w:t>
-      </w:r>
-      <w:r>
-        <w:rPr>
-          <w:rStyle w:val="VerbatimChar"/>
-          <w:rFonts w:hint="eastAsia"/>
-        </w:rPr>
-        <w:t xml:space="preserve">C11）各自的角度下标</w:t>
+        <w:t xml:space="preserve">│  ├─ run_psfmap.m             </w:t>
+      </w:r>
+      <w:r>
+        <w:rPr>
+          <w:rStyle w:val="VerbatimChar"/>
+          <w:rFonts w:hint="eastAsia"/>
+        </w:rPr>
+        <w:t xml:space="preserve">成像区域逐点成像（图</w:t>
+      </w:r>
+      <w:r>
+        <w:rPr>
+          <w:rStyle w:val="VerbatimChar"/>
+        </w:rPr>
+        <w:t xml:space="preserve"> F5 </w:t>
+      </w:r>
+      <w:r>
+        <w:rPr>
+          <w:rStyle w:val="VerbatimChar"/>
+          <w:rFonts w:hint="eastAsia"/>
+        </w:rPr>
+        <w:t xml:space="preserve">的数据，约</w:t>
+      </w:r>
+      <w:r>
+        <w:rPr>
+          <w:rStyle w:val="VerbatimChar"/>
+        </w:rPr>
+        <w:t xml:space="preserve"> 35 </w:t>
+      </w:r>
+      <w:r>
+        <w:rPr>
+          <w:rStyle w:val="VerbatimChar"/>
+          <w:rFonts w:hint="eastAsia"/>
+        </w:rPr>
+        <w:t xml:space="preserve">s）</w:t>
       </w:r>
       <w:r>
         <w:br/>
@@ -1377,14 +1771,14 @@
         <w:rPr>
           <w:rStyle w:val="VerbatimChar"/>
         </w:rPr>
-        <w:t xml:space="preserve">│  ├─ pulse_stats.m            </w:t>
-      </w:r>
-      <w:r>
-        <w:rPr>
-          <w:rStyle w:val="VerbatimChar"/>
-          <w:rFonts w:hint="eastAsia"/>
-        </w:rPr>
-        <w:t xml:space="preserve">从单散射子数据测中心频率与带宽</w:t>
+        <w:t xml:space="preserve">│  ├─ run_test_p3.m            </w:t>
+      </w:r>
+      <w:r>
+        <w:rPr>
+          <w:rStyle w:val="VerbatimChar"/>
+          <w:rFonts w:hint="eastAsia"/>
+        </w:rPr>
+        <w:t xml:space="preserve">点目标冒烟测试（正式跑之前先过这一关）</w:t>
       </w:r>
       <w:r>
         <w:br/>
@@ -1393,40 +1787,40 @@
         <w:rPr>
           <w:rStyle w:val="VerbatimChar"/>
         </w:rPr>
-        <w:t xml:space="preserve">│  ├─ metrics_resolution.m     </w:t>
-      </w:r>
-      <w:r>
-        <w:rPr>
-          <w:rStyle w:val="VerbatimChar"/>
-          <w:rFonts w:hint="eastAsia"/>
-        </w:rPr>
-        <w:t xml:space="preserve">点目标</w:t>
-      </w:r>
-      <w:r>
-        <w:rPr>
-          <w:rStyle w:val="VerbatimChar"/>
-        </w:rPr>
-        <w:t xml:space="preserve"> -10 dB </w:t>
-      </w:r>
-      <w:r>
-        <w:rPr>
-          <w:rStyle w:val="VerbatimChar"/>
-          <w:rFonts w:hint="eastAsia"/>
-        </w:rPr>
-        <w:t xml:space="preserve">横向</w:t>
-      </w:r>
-      <w:r>
-        <w:rPr>
-          <w:rStyle w:val="VerbatimChar"/>
-        </w:rPr>
-        <w:t xml:space="preserve"> / -6 dB </w:t>
-      </w:r>
-      <w:r>
-        <w:rPr>
-          <w:rStyle w:val="VerbatimChar"/>
-          <w:rFonts w:hint="eastAsia"/>
-        </w:rPr>
-        <w:t xml:space="preserve">轴向宽度</w:t>
+        <w:t xml:space="preserve">│  ├─ run_dense_snr.m          </w:t>
+      </w:r>
+      <w:r>
+        <w:rPr>
+          <w:rStyle w:val="VerbatimChar"/>
+          <w:rFonts w:hint="eastAsia"/>
+        </w:rPr>
+        <w:t xml:space="preserve">补充实验：4</w:t>
+      </w:r>
+      <w:r>
+        <w:rPr>
+          <w:rStyle w:val="VerbatimChar"/>
+        </w:rPr>
+        <w:t xml:space="preserve"> </w:t>
+      </w:r>
+      <w:r>
+        <w:rPr>
+          <w:rStyle w:val="VerbatimChar"/>
+          <w:rFonts w:hint="eastAsia"/>
+        </w:rPr>
+        <w:t xml:space="preserve">倍密度体模的</w:t>
+      </w:r>
+      <w:r>
+        <w:rPr>
+          <w:rStyle w:val="VerbatimChar"/>
+        </w:rPr>
+        <w:t xml:space="preserve"> SNR </w:t>
+      </w:r>
+      <w:r>
+        <w:rPr>
+          <w:rStyle w:val="VerbatimChar"/>
+          <w:rFonts w:hint="eastAsia"/>
+        </w:rPr>
+        <w:t xml:space="preserve">对照</w:t>
       </w:r>
       <w:r>
         <w:br/>
@@ -1435,20 +1829,40 @@
         <w:rPr>
           <w:rStyle w:val="VerbatimChar"/>
         </w:rPr>
-        <w:t xml:space="preserve">│  ├─ metrics_contrast.m       </w:t>
-      </w:r>
-      <w:r>
-        <w:rPr>
-          <w:rStyle w:val="VerbatimChar"/>
-          <w:rFonts w:hint="eastAsia"/>
-        </w:rPr>
-        <w:t xml:space="preserve">囊肿对比度与</w:t>
-      </w:r>
-      <w:r>
-        <w:rPr>
-          <w:rStyle w:val="VerbatimChar"/>
-        </w:rPr>
-        <w:t xml:space="preserve"> CNR</w:t>
+        <w:t xml:space="preserve">│  ├─ run_E7_gpu_throughput.m  </w:t>
+      </w:r>
+      <w:r>
+        <w:rPr>
+          <w:rStyle w:val="VerbatimChar"/>
+          <w:rFonts w:hint="eastAsia"/>
+        </w:rPr>
+        <w:t xml:space="preserve">可选：CPU/GPU</w:t>
+      </w:r>
+      <w:r>
+        <w:rPr>
+          <w:rStyle w:val="VerbatimChar"/>
+        </w:rPr>
+        <w:t xml:space="preserve"> </w:t>
+      </w:r>
+      <w:r>
+        <w:rPr>
+          <w:rStyle w:val="VerbatimChar"/>
+          <w:rFonts w:hint="eastAsia"/>
+        </w:rPr>
+        <w:t xml:space="preserve">算法帧率（本机无</w:t>
+      </w:r>
+      <w:r>
+        <w:rPr>
+          <w:rStyle w:val="VerbatimChar"/>
+        </w:rPr>
+        <w:t xml:space="preserve"> </w:t>
+      </w:r>
+      <w:r>
+        <w:rPr>
+          <w:rStyle w:val="VerbatimChar"/>
+          <w:rFonts w:hint="eastAsia"/>
+        </w:rPr>
+        <w:t xml:space="preserve">GPU，未执行）</w:t>
       </w:r>
       <w:r>
         <w:br/>
@@ -1457,27 +1871,40 @@
         <w:rPr>
           <w:rStyle w:val="VerbatimChar"/>
         </w:rPr>
-        <w:t xml:space="preserve">│  ├─ metrics_speckle.m        </w:t>
-      </w:r>
-      <w:r>
-        <w:rPr>
-          <w:rStyle w:val="VerbatimChar"/>
-          <w:rFonts w:hint="eastAsia"/>
-        </w:rPr>
-        <w:t xml:space="preserve">散斑</w:t>
-      </w:r>
-      <w:r>
-        <w:rPr>
-          <w:rStyle w:val="VerbatimChar"/>
-        </w:rPr>
-        <w:t xml:space="preserve"> </w:t>
-      </w:r>
-      <w:r>
-        <w:rPr>
-          <w:rStyle w:val="VerbatimChar"/>
-          <w:rFonts w:hint="eastAsia"/>
-        </w:rPr>
-        <w:t xml:space="preserve">μ/σ、相关长度、直方图</w:t>
+        <w:t xml:space="preserve">│  ├─ make_figures.m           </w:t>
+      </w:r>
+      <w:r>
+        <w:rPr>
+          <w:rStyle w:val="VerbatimChar"/>
+          <w:rFonts w:hint="eastAsia"/>
+        </w:rPr>
+        <w:t xml:space="preserve">生成</w:t>
+      </w:r>
+      <w:r>
+        <w:rPr>
+          <w:rStyle w:val="VerbatimChar"/>
+        </w:rPr>
+        <w:t xml:space="preserve"> </w:t>
+      </w:r>
+      <w:r>
+        <w:rPr>
+          <w:rStyle w:val="VerbatimChar"/>
+          <w:rFonts w:hint="eastAsia"/>
+        </w:rPr>
+        <w:t xml:space="preserve">F1–F12（含</w:t>
+      </w:r>
+      <w:r>
+        <w:rPr>
+          <w:rStyle w:val="VerbatimChar"/>
+        </w:rPr>
+        <w:t xml:space="preserve"> </w:t>
+      </w:r>
+      <w:r>
+        <w:rPr>
+          <w:rStyle w:val="VerbatimChar"/>
+          <w:rFonts w:hint="eastAsia"/>
+        </w:rPr>
+        <w:t xml:space="preserve">F5）</w:t>
       </w:r>
       <w:r>
         <w:br/>
@@ -1486,14 +1913,40 @@
         <w:rPr>
           <w:rStyle w:val="VerbatimChar"/>
         </w:rPr>
-        <w:t xml:space="preserve">│  ├─ crossing_width.m         </w:t>
-      </w:r>
-      <w:r>
-        <w:rPr>
-          <w:rStyle w:val="VerbatimChar"/>
-          <w:rFonts w:hint="eastAsia"/>
-        </w:rPr>
-        <w:t xml:space="preserve">曲线在指定电平处的宽度（线性插值）</w:t>
+        <w:t xml:space="preserve">│  ├─ make_fig_pointtargets.m  </w:t>
+      </w:r>
+      <w:r>
+        <w:rPr>
+          <w:rStyle w:val="VerbatimChar"/>
+          <w:rFonts w:hint="eastAsia"/>
+        </w:rPr>
+        <w:t xml:space="preserve">生成</w:t>
+      </w:r>
+      <w:r>
+        <w:rPr>
+          <w:rStyle w:val="VerbatimChar"/>
+        </w:rPr>
+        <w:t xml:space="preserve"> </w:t>
+      </w:r>
+      <w:r>
+        <w:rPr>
+          <w:rStyle w:val="VerbatimChar"/>
+          <w:rFonts w:hint="eastAsia"/>
+        </w:rPr>
+        <w:t xml:space="preserve">F13（点目标真实位置</w:t>
+      </w:r>
+      <w:r>
+        <w:rPr>
+          <w:rStyle w:val="VerbatimChar"/>
+        </w:rPr>
+        <w:t xml:space="preserve"> + </w:t>
+      </w:r>
+      <w:r>
+        <w:rPr>
+          <w:rStyle w:val="VerbatimChar"/>
+          <w:rFonts w:hint="eastAsia"/>
+        </w:rPr>
+        <w:t xml:space="preserve">定位误差，只读已存数据）</w:t>
       </w:r>
       <w:r>
         <w:br/>
@@ -1502,283 +1955,7 @@
         <w:rPr>
           <w:rStyle w:val="VerbatimChar"/>
         </w:rPr>
-        <w:t xml:space="preserve">│  ├─ peak_pos.m               </w:t>
-      </w:r>
-      <w:r>
-        <w:rPr>
-          <w:rStyle w:val="VerbatimChar"/>
-          <w:rFonts w:hint="eastAsia"/>
-        </w:rPr>
-        <w:t xml:space="preserve">点目标轴向位置（强度质心，抗旁瓣跳变）</w:t>
-      </w:r>
-      <w:r>
-        <w:br/>
-      </w:r>
-      <w:r>
-        <w:rPr>
-          <w:rStyle w:val="VerbatimChar"/>
-        </w:rPr>
-        <w:t xml:space="preserve">│  ├─ to_db.m                  </w:t>
-      </w:r>
-      <w:r>
-        <w:rPr>
-          <w:rStyle w:val="VerbatimChar"/>
-          <w:rFonts w:hint="eastAsia"/>
-        </w:rPr>
-        <w:t xml:space="preserve">包络</w:t>
-      </w:r>
-      <w:r>
-        <w:rPr>
-          <w:rStyle w:val="VerbatimChar"/>
-        </w:rPr>
-        <w:t xml:space="preserve"> → dB </w:t>
-      </w:r>
-      <w:r>
-        <w:rPr>
-          <w:rStyle w:val="VerbatimChar"/>
-          <w:rFonts w:hint="eastAsia"/>
-        </w:rPr>
-        <w:t xml:space="preserve">图（截断显示动态范围）</w:t>
-      </w:r>
-      <w:r>
-        <w:br/>
-      </w:r>
-      <w:r>
-        <w:rPr>
-          <w:rStyle w:val="VerbatimChar"/>
-        </w:rPr>
-        <w:t xml:space="preserve">│  └─ save_fig.m               </w:t>
-      </w:r>
-      <w:r>
-        <w:rPr>
-          <w:rStyle w:val="VerbatimChar"/>
-          <w:rFonts w:hint="eastAsia"/>
-        </w:rPr>
-        <w:t xml:space="preserve">图窗</w:t>
-      </w:r>
-      <w:r>
-        <w:rPr>
-          <w:rStyle w:val="VerbatimChar"/>
-        </w:rPr>
-        <w:t xml:space="preserve"> → PNG</w:t>
-      </w:r>
-      <w:r>
-        <w:br/>
-      </w:r>
-      <w:r>
-        <w:rPr>
-          <w:rStyle w:val="VerbatimChar"/>
-        </w:rPr>
-        <w:t xml:space="preserve">├─ run/                        </w:t>
-      </w:r>
-      <w:r>
-        <w:rPr>
-          <w:rStyle w:val="VerbatimChar"/>
-          <w:rFonts w:hint="eastAsia"/>
-        </w:rPr>
-        <w:t xml:space="preserve">入口脚本</w:t>
-      </w:r>
-      <w:r>
-        <w:br/>
-      </w:r>
-      <w:r>
-        <w:rPr>
-          <w:rStyle w:val="VerbatimChar"/>
-        </w:rPr>
-        <w:t xml:space="preserve">│  ├─ run_core.m               </w:t>
-      </w:r>
-      <w:r>
-        <w:rPr>
-          <w:rStyle w:val="VerbatimChar"/>
-          <w:rFonts w:hint="eastAsia"/>
-        </w:rPr>
-        <w:t xml:space="preserve">主流程</w:t>
-      </w:r>
-      <w:r>
-        <w:rPr>
-          <w:rStyle w:val="VerbatimChar"/>
-        </w:rPr>
-        <w:t xml:space="preserve"> E0–E5</w:t>
-      </w:r>
-      <w:r>
-        <w:br/>
-      </w:r>
-      <w:r>
-        <w:rPr>
-          <w:rStyle w:val="VerbatimChar"/>
-        </w:rPr>
-        <w:t xml:space="preserve">│  ├─ run_tail.m               P1 </w:t>
-      </w:r>
-      <w:r>
-        <w:rPr>
-          <w:rStyle w:val="VerbatimChar"/>
-          <w:rFonts w:hint="eastAsia"/>
-        </w:rPr>
-        <w:t xml:space="preserve">之后的收尾（囊肿体模</w:t>
-      </w:r>
-      <w:r>
-        <w:rPr>
-          <w:rStyle w:val="VerbatimChar"/>
-        </w:rPr>
-        <w:t xml:space="preserve"> + </w:t>
-      </w:r>
-      <w:r>
-        <w:rPr>
-          <w:rStyle w:val="VerbatimChar"/>
-          <w:rFonts w:hint="eastAsia"/>
-        </w:rPr>
-        <w:t xml:space="preserve">噪声</w:t>
-      </w:r>
-      <w:r>
-        <w:rPr>
-          <w:rStyle w:val="VerbatimChar"/>
-        </w:rPr>
-        <w:t xml:space="preserve"> + </w:t>
-      </w:r>
-      <w:r>
-        <w:rPr>
-          <w:rStyle w:val="VerbatimChar"/>
-          <w:rFonts w:hint="eastAsia"/>
-        </w:rPr>
-        <w:t xml:space="preserve">分析</w:t>
-      </w:r>
-      <w:r>
-        <w:rPr>
-          <w:rStyle w:val="VerbatimChar"/>
-        </w:rPr>
-        <w:t xml:space="preserve"> + </w:t>
-      </w:r>
-      <w:r>
-        <w:rPr>
-          <w:rStyle w:val="VerbatimChar"/>
-          <w:rFonts w:hint="eastAsia"/>
-        </w:rPr>
-        <w:t xml:space="preserve">出图）</w:t>
-      </w:r>
-      <w:r>
-        <w:br/>
-      </w:r>
-      <w:r>
-        <w:rPr>
-          <w:rStyle w:val="VerbatimChar"/>
-        </w:rPr>
-        <w:t xml:space="preserve">│  ├─ run_refresh.m            </w:t>
-      </w:r>
-      <w:r>
-        <w:rPr>
-          <w:rStyle w:val="VerbatimChar"/>
-          <w:rFonts w:hint="eastAsia"/>
-        </w:rPr>
-        <w:t xml:space="preserve">只重算声场/指标/图/表</w:t>
-      </w:r>
-      <w:r>
-        <w:br/>
-      </w:r>
-      <w:r>
-        <w:rPr>
-          <w:rStyle w:val="VerbatimChar"/>
-        </w:rPr>
-        <w:t xml:space="preserve">│  ├─ run_test_p3.m            </w:t>
-      </w:r>
-      <w:r>
-        <w:rPr>
-          <w:rStyle w:val="VerbatimChar"/>
-          <w:rFonts w:hint="eastAsia"/>
-        </w:rPr>
-        <w:t xml:space="preserve">点目标冒烟测试（正式跑之前先过这一关）</w:t>
-      </w:r>
-      <w:r>
-        <w:br/>
-      </w:r>
-      <w:r>
-        <w:rPr>
-          <w:rStyle w:val="VerbatimChar"/>
-        </w:rPr>
-        <w:t xml:space="preserve">│  ├─ run_dense_snr.m          </w:t>
-      </w:r>
-      <w:r>
-        <w:rPr>
-          <w:rStyle w:val="VerbatimChar"/>
-          <w:rFonts w:hint="eastAsia"/>
-        </w:rPr>
-        <w:t xml:space="preserve">补充实验：4</w:t>
-      </w:r>
-      <w:r>
-        <w:rPr>
-          <w:rStyle w:val="VerbatimChar"/>
-        </w:rPr>
-        <w:t xml:space="preserve"> </w:t>
-      </w:r>
-      <w:r>
-        <w:rPr>
-          <w:rStyle w:val="VerbatimChar"/>
-          <w:rFonts w:hint="eastAsia"/>
-        </w:rPr>
-        <w:t xml:space="preserve">倍密度体模的</w:t>
-      </w:r>
-      <w:r>
-        <w:rPr>
-          <w:rStyle w:val="VerbatimChar"/>
-        </w:rPr>
-        <w:t xml:space="preserve"> SNR </w:t>
-      </w:r>
-      <w:r>
-        <w:rPr>
-          <w:rStyle w:val="VerbatimChar"/>
-          <w:rFonts w:hint="eastAsia"/>
-        </w:rPr>
-        <w:t xml:space="preserve">对照</w:t>
-      </w:r>
-      <w:r>
-        <w:br/>
-      </w:r>
-      <w:r>
-        <w:rPr>
-          <w:rStyle w:val="VerbatimChar"/>
-        </w:rPr>
-        <w:t xml:space="preserve">│  ├─ run_E7_gpu_throughput.m  </w:t>
-      </w:r>
-      <w:r>
-        <w:rPr>
-          <w:rStyle w:val="VerbatimChar"/>
-          <w:rFonts w:hint="eastAsia"/>
-        </w:rPr>
-        <w:t xml:space="preserve">可选：CPU/GPU</w:t>
-      </w:r>
-      <w:r>
-        <w:rPr>
-          <w:rStyle w:val="VerbatimChar"/>
-        </w:rPr>
-        <w:t xml:space="preserve"> </w:t>
-      </w:r>
-      <w:r>
-        <w:rPr>
-          <w:rStyle w:val="VerbatimChar"/>
-          <w:rFonts w:hint="eastAsia"/>
-        </w:rPr>
-        <w:t xml:space="preserve">算法帧率（本机无</w:t>
-      </w:r>
-      <w:r>
-        <w:rPr>
-          <w:rStyle w:val="VerbatimChar"/>
-        </w:rPr>
-        <w:t xml:space="preserve"> </w:t>
-      </w:r>
-      <w:r>
-        <w:rPr>
-          <w:rStyle w:val="VerbatimChar"/>
-          <w:rFonts w:hint="eastAsia"/>
-        </w:rPr>
-        <w:t xml:space="preserve">GPU，未执行）</w:t>
-      </w:r>
-      <w:r>
-        <w:br/>
-      </w:r>
-      <w:r>
-        <w:rPr>
-          <w:rStyle w:val="VerbatimChar"/>
-        </w:rPr>
-        <w:t xml:space="preserve">│  ├─ make_figures.m           </w:t>
+        <w:t xml:space="preserve">│  ├─ make_fig_coverage.m      </w:t>
       </w:r>
       <w:r>
         <w:rPr>
@@ -1791,49 +1968,14 @@
         <w:rPr>
           <w:rStyle w:val="VerbatimChar"/>
         </w:rPr>
-        <w:t xml:space="preserve"> F1–F13</w:t>
-      </w:r>
-      <w:r>
-        <w:br/>
-      </w:r>
-      <w:r>
-        <w:rPr>
-          <w:rStyle w:val="VerbatimChar"/>
-        </w:rPr>
-        <w:t xml:space="preserve">│  ├─ make_fig_pointtargets.m  </w:t>
-      </w:r>
-      <w:r>
-        <w:rPr>
-          <w:rStyle w:val="VerbatimChar"/>
-          <w:rFonts w:hint="eastAsia"/>
-        </w:rPr>
-        <w:t xml:space="preserve">生成</w:t>
-      </w:r>
-      <w:r>
-        <w:rPr>
-          <w:rStyle w:val="VerbatimChar"/>
-        </w:rPr>
-        <w:t xml:space="preserve"> </w:t>
-      </w:r>
-      <w:r>
-        <w:rPr>
-          <w:rStyle w:val="VerbatimChar"/>
-          <w:rFonts w:hint="eastAsia"/>
-        </w:rPr>
-        <w:t xml:space="preserve">F14（点目标真实位置</w:t>
-      </w:r>
-      <w:r>
-        <w:rPr>
-          <w:rStyle w:val="VerbatimChar"/>
-        </w:rPr>
-        <w:t xml:space="preserve"> + </w:t>
-      </w:r>
-      <w:r>
-        <w:rPr>
-          <w:rStyle w:val="VerbatimChar"/>
-          <w:rFonts w:hint="eastAsia"/>
-        </w:rPr>
-        <w:t xml:space="preserve">定位误差，只读已存数据）</w:t>
+        <w:t xml:space="preserve"> </w:t>
+      </w:r>
+      <w:r>
+        <w:rPr>
+          <w:rStyle w:val="VerbatimChar"/>
+          <w:rFonts w:hint="eastAsia"/>
+        </w:rPr>
+        <w:t xml:space="preserve">F14（成像加权与整幅范围的关系）</w:t>
       </w:r>
       <w:r>
         <w:br/>
@@ -2030,7 +2172,7 @@
         <w:rPr>
           <w:rStyle w:val="VerbatimChar"/>
         </w:rPr>
-        <w:t xml:space="preserve"> └─ stage_analysis ── compound_rf, metrics_contrast, metrics_speckle,</w:t>
+        <w:t xml:space="preserve"> └─ stage_analysis ── compound_rf, metrics_contrast,</w:t>
       </w:r>
       <w:r>
         <w:br/>
@@ -2061,7 +2203,7 @@
         <w:rPr>
           <w:rStyle w:val="VerbatimChar"/>
         </w:rPr>
-        <w:t xml:space="preserve"> + make_figures + make_report_tables</w:t>
+        <w:t xml:space="preserve"> + make_figures + make_fig_coverage + make_report_tables</w:t>
       </w:r>
     </w:p>
     <w:p>
@@ -2111,72 +2253,7 @@
           <w:rStyle w:val="VerbatimChar"/>
           <w:rFonts w:hint="eastAsia"/>
         </w:rPr>
-        <w:t xml:space="preserve">给出：c,</w:t>
-      </w:r>
-      <w:r>
-        <w:rPr>
-          <w:rStyle w:val="VerbatimChar"/>
-        </w:rPr>
-        <w:t xml:space="preserve"> fs, </w:t>
-      </w:r>
-      <w:r>
-        <w:rPr>
-          <w:rStyle w:val="VerbatimChar"/>
-          <w:rFonts w:hint="eastAsia"/>
-        </w:rPr>
-        <w:t xml:space="preserve">阵列,</w:t>
-      </w:r>
-      <w:r>
-        <w:rPr>
-          <w:rStyle w:val="VerbatimChar"/>
-        </w:rPr>
-        <w:t xml:space="preserve"> </w:t>
-      </w:r>
-      <w:r>
-        <w:rPr>
-          <w:rStyle w:val="VerbatimChar"/>
-          <w:rFonts w:hint="eastAsia"/>
-        </w:rPr>
-        <w:t xml:space="preserve">角度,</w:t>
-      </w:r>
-      <w:r>
-        <w:rPr>
-          <w:rStyle w:val="VerbatimChar"/>
-        </w:rPr>
-        <w:t xml:space="preserve"> </w:t>
-      </w:r>
-      <w:r>
-        <w:rPr>
-          <w:rStyle w:val="VerbatimChar"/>
-          <w:rFonts w:hint="eastAsia"/>
-        </w:rPr>
-        <w:t xml:space="preserve">网格,</w:t>
-      </w:r>
-      <w:r>
-        <w:rPr>
-          <w:rStyle w:val="VerbatimChar"/>
-        </w:rPr>
-        <w:t xml:space="preserve"> </w:t>
-      </w:r>
-      <w:r>
-        <w:rPr>
-          <w:rStyle w:val="VerbatimChar"/>
-          <w:rFonts w:hint="eastAsia"/>
-        </w:rPr>
-        <w:t xml:space="preserve">体模,</w:t>
-      </w:r>
-      <w:r>
-        <w:rPr>
-          <w:rStyle w:val="VerbatimChar"/>
-        </w:rPr>
-        <w:t xml:space="preserve"> </w:t>
-      </w:r>
-      <w:r>
-        <w:rPr>
-          <w:rStyle w:val="VerbatimChar"/>
-          <w:rFonts w:hint="eastAsia"/>
-        </w:rPr>
-        <w:t xml:space="preserve">噪声</w:t>
+        <w:t xml:space="preserve">给出：soundSpeed、sampleRate、阵列、角度、网格、体模、噪声</w:t>
       </w:r>
       <w:r>
         <w:br/>
@@ -3285,7 +3362,7 @@
         <w:rPr>
           <w:rStyle w:val="VerbatimChar"/>
         </w:rPr>
-        <w:t xml:space="preserve">hw = z/(2*Fnum)</w:t>
+        <w:t xml:space="preserve">hw = z/(2*fNumber)</w:t>
       </w:r>
       <w:r>
         <w:t xml:space="preserve"> </w:t>
@@ -3303,7 +3380,7 @@
         <w:rPr>
           <w:rStyle w:val="VerbatimChar"/>
         </w:rPr>
-        <w:t xml:space="preserve">m = |xe-x| &lt;= hw</w:t>
+        <w:t xml:space="preserve">m = |elementX-x| &lt;= hw</w:t>
       </w:r>
       <w:r>
         <w:t xml:space="preserve"> </w:t>
@@ -3915,7 +3992,7 @@
       </w:r>
     </w:p>
     <w:bookmarkEnd w:id="16"/>
-    <w:bookmarkStart w:id="17" w:name="声场与合成发射声场stage_fields.m"/>
+    <w:bookmarkStart w:id="17" w:name="声场与成像区域的均匀性stage_fields.m-psf_map.m"/>
     <w:p>
       <w:pPr>
         <w:pStyle w:val="Heading3"/>
@@ -3927,13 +4004,28 @@
         <w:rPr>
           <w:rFonts w:hint="eastAsia"/>
         </w:rPr>
-        <w:t xml:space="preserve">声场与”合成发射声场”（</w:t>
+        <w:t xml:space="preserve">声场与成像区域的均匀性（</w:t>
       </w:r>
       <w:r>
         <w:rPr>
           <w:rStyle w:val="VerbatimChar"/>
         </w:rPr>
         <w:t xml:space="preserve">stage_fields.m</w:t>
+      </w:r>
+      <w:r>
+        <w:t xml:space="preserve"> </w:t>
+      </w:r>
+      <w:r>
+        <w:t xml:space="preserve">/</w:t>
+      </w:r>
+      <w:r>
+        <w:t xml:space="preserve"> </w:t>
+      </w:r>
+      <w:r>
+        <w:rPr>
+          <w:rStyle w:val="VerbatimChar"/>
+        </w:rPr>
+        <w:t xml:space="preserve">psf_map.m</w:t>
       </w:r>
       <w:r>
         <w:rPr>
@@ -3959,7 +4051,22 @@
         <w:rPr>
           <w:rFonts w:hint="eastAsia"/>
         </w:rPr>
-        <w:t xml:space="preserve">给出某角度在网格点上的声压波形。把</w:t>
+        <w:t xml:space="preserve">给出某角度在网格点上的声压波形，</w:t>
+      </w:r>
+      <w:r>
+        <w:rPr>
+          <w:rStyle w:val="VerbatimChar"/>
+        </w:rPr>
+        <w:t xml:space="preserve">stage_fields</w:t>
+      </w:r>
+      <w:r>
+        <w:t xml:space="preserve"> </w:t>
+      </w:r>
+      <w:r>
+        <w:rPr>
+          <w:rFonts w:hint="eastAsia"/>
+        </w:rPr>
+        <w:t xml:space="preserve">把</w:t>
       </w:r>
       <w:r>
         <w:t xml:space="preserve"> 11 </w:t>
@@ -3968,43 +4075,155 @@
         <w:rPr>
           <w:rFonts w:hint="eastAsia"/>
         </w:rPr>
-        <w:t xml:space="preserve">个角度按”到焦点的传播时间”平移后</w:t>
-      </w:r>
-      <w:r>
-        <w:t xml:space="preserve"> </w:t>
-      </w:r>
-      <w:r>
-        <w:rPr>
-          <w:rFonts w:hint="eastAsia"/>
-        </w:rPr>
-        <w:t xml:space="preserve">相加，就得到合成发射场：焦点处各脉冲对齐（增益约</w:t>
-      </w:r>
-      <w:r>
-        <w:t xml:space="preserve"> </w:t>
-      </w:r>
-      <w:r>
-        <w:rPr>
-          <w:rFonts w:hint="eastAsia"/>
-        </w:rPr>
-        <w:t xml:space="preserve">n），离开焦点不再对齐，于是出现</w:t>
-      </w:r>
-      <w:r>
-        <w:t xml:space="preserve"> </w:t>
-      </w:r>
-      <w:r>
-        <w:rPr>
-          <w:rFonts w:hint="eastAsia"/>
-        </w:rPr>
-        <w:t xml:space="preserve">焦斑。图</w:t>
-      </w:r>
-      <w:r>
-        <w:t xml:space="preserve"> F5 </w:t>
-      </w:r>
-      <w:r>
-        <w:rPr>
-          <w:rFonts w:hint="eastAsia"/>
-        </w:rPr>
-        <w:t xml:space="preserve">显示它的横向剖面与真实聚焦发射几乎重合。</w:t>
+        <w:t xml:space="preserve">个角度各自的峰值声压</w:t>
+      </w:r>
+      <w:r>
+        <w:t xml:space="preserve"> </w:t>
+      </w:r>
+      <w:r>
+        <w:rPr>
+          <w:rFonts w:hint="eastAsia"/>
+        </w:rPr>
+        <w:t xml:space="preserve">存成</w:t>
+      </w:r>
+      <w:r>
+        <w:t xml:space="preserve"> </w:t>
+      </w:r>
+      <w:r>
+        <w:rPr>
+          <w:rStyle w:val="VerbatimChar"/>
+        </w:rPr>
+        <w:t xml:space="preserve">peakAll</w:t>
+      </w:r>
+      <w:r>
+        <w:rPr>
+          <w:rFonts w:hint="eastAsia"/>
+        </w:rPr>
+        <w:t xml:space="preserve">（图</w:t>
+      </w:r>
+      <w:r>
+        <w:t xml:space="preserve"> </w:t>
+      </w:r>
+      <w:r>
+        <w:rPr>
+          <w:rFonts w:hint="eastAsia"/>
+        </w:rPr>
+        <w:t xml:space="preserve">F3/F4）。把这些峰值按角度相加（</w:t>
+      </w:r>
+      <w:r>
+        <w:rPr>
+          <w:rStyle w:val="VerbatimChar"/>
+        </w:rPr>
+        <w:t xml:space="preserve">sum(peakAll,3)</w:t>
+      </w:r>
+      <w:r>
+        <w:rPr>
+          <w:rFonts w:hint="eastAsia"/>
+        </w:rPr>
+        <w:t xml:space="preserve">）就是</w:t>
+      </w:r>
+      <w:r>
+        <w:t xml:space="preserve"> DAS </w:t>
+      </w:r>
+      <w:r>
+        <w:rPr>
+          <w:rFonts w:hint="eastAsia"/>
+        </w:rPr>
+        <w:t xml:space="preserve">之后图像</w:t>
+      </w:r>
+      <w:r>
+        <w:t xml:space="preserve"> </w:t>
+      </w:r>
+      <w:r>
+        <w:rPr>
+          <w:rFonts w:hint="eastAsia"/>
+        </w:rPr>
+        <w:t xml:space="preserve">实际看到的发射加权</w:t>
+      </w:r>
+      <w:r>
+        <w:t xml:space="preserve"> </w:t>
+      </w:r>
+      <m:oMath>
+        <m:nary>
+          <m:naryPr>
+            <m:chr m:val="∑"/>
+            <m:limLoc m:val="undOvr"/>
+            <m:subHide m:val="off"/>
+            <m:supHide m:val="on"/>
+          </m:naryPr>
+          <m:sub>
+            <m:r>
+              <m:t>α</m:t>
+            </m:r>
+          </m:sub>
+          <m:sup>
+            <m:r>
+              <m:t>​</m:t>
+            </m:r>
+          </m:sup>
+          <m:e>
+            <m:r>
+              <m:rPr>
+                <m:sty m:val="p"/>
+              </m:rPr>
+              <m:t>|</m:t>
+            </m:r>
+          </m:e>
+        </m:nary>
+        <m:sSub>
+          <m:e>
+            <m:r>
+              <m:t>p</m:t>
+            </m:r>
+          </m:e>
+          <m:sub>
+            <m:r>
+              <m:t>α</m:t>
+            </m:r>
+          </m:sub>
+        </m:sSub>
+        <m:r>
+          <m:rPr>
+            <m:sty m:val="p"/>
+          </m:rPr>
+          <m:t>|</m:t>
+        </m:r>
+      </m:oMath>
+      <w:r>
+        <w:rPr>
+          <w:rFonts w:hint="eastAsia"/>
+        </w:rPr>
+        <w:t xml:space="preserve">，图</w:t>
+      </w:r>
+      <w:r>
+        <w:t xml:space="preserve"> F14(b) </w:t>
+      </w:r>
+      <w:r>
+        <w:rPr>
+          <w:rFonts w:hint="eastAsia"/>
+        </w:rPr>
+        <w:t xml:space="preserve">画的就是它：中央一条带是</w:t>
+      </w:r>
+      <w:r>
+        <w:t xml:space="preserve"> 0 dB</w:t>
+      </w:r>
+      <w:r>
+        <w:t xml:space="preserve"> </w:t>
+      </w:r>
+      <w:r>
+        <w:rPr>
+          <w:rFonts w:hint="eastAsia"/>
+        </w:rPr>
+        <w:t xml:space="preserve">（11</w:t>
+      </w:r>
+      <w:r>
+        <w:t xml:space="preserve"> </w:t>
+      </w:r>
+      <w:r>
+        <w:rPr>
+          <w:rFonts w:hint="eastAsia"/>
+        </w:rPr>
+        <w:t xml:space="preserve">束全照到），向两侧随覆盖束数减少而下降。</w:t>
       </w:r>
     </w:p>
     <w:p>
@@ -4017,31 +4236,471 @@
           <w:b/>
           <w:bCs/>
         </w:rPr>
-        <w:t xml:space="preserve">注意</w:t>
-      </w:r>
-      <w:r>
-        <w:rPr>
-          <w:rFonts w:hint="eastAsia"/>
-        </w:rPr>
-        <w:t xml:space="preserve">：这里的平移是”每个角度一个常数”（到焦点的传播时间），不是逐像素的波束形成</w:t>
-      </w:r>
-      <w:r>
-        <w:t xml:space="preserve"> </w:t>
-      </w:r>
-      <w:r>
-        <w:rPr>
-          <w:rFonts w:hint="eastAsia"/>
-        </w:rPr>
-        <w:t xml:space="preserve">延时。若用逐像素延时，处处对齐，叠加结果只是单角度声场的</w:t>
-      </w:r>
-      <w:r>
-        <w:t xml:space="preserve"> n </w:t>
-      </w:r>
-      <w:r>
-        <w:rPr>
-          <w:rFonts w:hint="eastAsia"/>
-        </w:rPr>
-        <w:t xml:space="preserve">倍，看不到焦斑。</w:t>
+        <w:t xml:space="preserve">要检验成像区域，不能只看声场，要逐点做一次成像</w:t>
+      </w:r>
+      <w:r>
+        <w:t xml:space="preserve">。</w:t>
+      </w:r>
+      <w:r>
+        <w:rPr>
+          <w:rStyle w:val="VerbatimChar"/>
+        </w:rPr>
+        <w:t xml:space="preserve">psf_map</w:t>
+      </w:r>
+      <w:r>
+        <w:t xml:space="preserve"> </w:t>
+      </w:r>
+      <w:r>
+        <w:rPr>
+          <w:rFonts w:hint="eastAsia"/>
+        </w:rPr>
+        <w:t xml:space="preserve">在</w:t>
+      </w:r>
+      <w:r>
+        <w:t xml:space="preserve"> </w:t>
+      </w:r>
+      <m:oMath>
+        <m:r>
+          <m:t>x</m:t>
+        </m:r>
+        <m:r>
+          <m:rPr>
+            <m:sty m:val="p"/>
+          </m:rPr>
+          <m:t>=</m:t>
+        </m:r>
+        <m:r>
+          <m:rPr>
+            <m:sty m:val="p"/>
+          </m:rPr>
+          <m:t>±</m:t>
+        </m:r>
+        <m:r>
+          <m:t>10</m:t>
+        </m:r>
+      </m:oMath>
+      <w:r>
+        <w:t xml:space="preserve"> </w:t>
+      </w:r>
+      <w:r>
+        <w:t xml:space="preserve">mm、</w:t>
+      </w:r>
+      <w:r>
+        <w:t xml:space="preserve"> </w:t>
+      </w:r>
+      <m:oMath>
+        <m:r>
+          <m:t>z</m:t>
+        </m:r>
+        <m:r>
+          <m:rPr>
+            <m:sty m:val="p"/>
+          </m:rPr>
+          <m:t>=</m:t>
+        </m:r>
+        <m:r>
+          <m:t>15</m:t>
+        </m:r>
+      </m:oMath>
+      <w:r>
+        <w:t xml:space="preserve">–50 mm </w:t>
+      </w:r>
+      <w:r>
+        <w:rPr>
+          <w:rFonts w:hint="eastAsia"/>
+        </w:rPr>
+        <w:t xml:space="preserve">的网格上逐点放一个单散射子，每个点都走完整链路（11</w:t>
+      </w:r>
+      <w:r>
+        <w:t xml:space="preserve"> </w:t>
+      </w:r>
+      <w:r>
+        <w:rPr>
+          <w:rFonts w:hint="eastAsia"/>
+        </w:rPr>
+        <w:t xml:space="preserve">个角度发射</w:t>
+      </w:r>
+      <w:r>
+        <w:t xml:space="preserve"> →</w:t>
+      </w:r>
+      <w:r>
+        <w:t xml:space="preserve"> </w:t>
+      </w:r>
+      <w:r>
+        <w:t xml:space="preserve">128 </w:t>
+      </w:r>
+      <w:r>
+        <w:rPr>
+          <w:rFonts w:hint="eastAsia"/>
+        </w:rPr>
+        <w:t xml:space="preserve">通道</w:t>
+      </w:r>
+      <w:r>
+        <w:t xml:space="preserve"> → DAS → </w:t>
+      </w:r>
+      <w:r>
+        <w:rPr>
+          <w:rFonts w:hint="eastAsia"/>
+        </w:rPr>
+        <w:t xml:space="preserve">射频域相加</w:t>
+      </w:r>
+      <w:r>
+        <w:t xml:space="preserve"> → </w:t>
+      </w:r>
+      <w:r>
+        <w:rPr>
+          <w:rFonts w:hint="eastAsia"/>
+        </w:rPr>
+        <w:t xml:space="preserve">包络），得到该点的峰值幅度、相干因子与</w:t>
+      </w:r>
+      <w:r>
+        <w:t xml:space="preserve"> −6 dB </w:t>
+      </w:r>
+      <w:r>
+        <w:rPr>
+          <w:rFonts w:hint="eastAsia"/>
+        </w:rPr>
+        <w:t xml:space="preserve">宽度，</w:t>
+      </w:r>
+      <w:r>
+        <w:t xml:space="preserve"> </w:t>
+      </w:r>
+      <w:r>
+        <w:rPr>
+          <w:rFonts w:hint="eastAsia"/>
+        </w:rPr>
+        <w:t xml:space="preserve">图</w:t>
+      </w:r>
+      <w:r>
+        <w:t xml:space="preserve"> F5 </w:t>
+      </w:r>
+      <w:r>
+        <w:rPr>
+          <w:rFonts w:hint="eastAsia"/>
+        </w:rPr>
+        <w:t xml:space="preserve">画的就是它：同一深度内幅值起伏</w:t>
+      </w:r>
+      <w:r>
+        <w:t xml:space="preserve"> ±1.1 </w:t>
+      </w:r>
+      <w:r>
+        <w:rPr>
+          <w:rFonts w:hint="eastAsia"/>
+        </w:rPr>
+        <w:t xml:space="preserve">dB，横向宽度</w:t>
+      </w:r>
+      <w:r>
+        <w:t xml:space="preserve"> 0.66–0.73 mm </w:t>
+      </w:r>
+      <w:r>
+        <w:rPr>
+          <w:rFonts w:hint="eastAsia"/>
+        </w:rPr>
+        <w:t xml:space="preserve">处处相同。</w:t>
+      </w:r>
+    </w:p>
+    <w:p>
+      <w:pPr>
+        <w:pStyle w:val="BodyText"/>
+      </w:pPr>
+      <w:r>
+        <w:rPr>
+          <w:rFonts w:hint="eastAsia"/>
+          <w:b/>
+          <w:bCs/>
+        </w:rPr>
+        <w:t xml:space="preserve">一个曾经的错误做法（已删除，见</w:t>
+      </w:r>
+      <w:r>
+        <w:rPr>
+          <w:b/>
+          <w:bCs/>
+        </w:rPr>
+        <w:t xml:space="preserve"> </w:t>
+      </w:r>
+      <w:r>
+        <w:rPr>
+          <w:rStyle w:val="VerbatimChar"/>
+          <w:rFonts w:hint="eastAsia"/>
+          <w:b/>
+          <w:bCs/>
+        </w:rPr>
+        <w:t xml:space="preserve">docs/实验报告_讨论与附录.md</w:t>
+      </w:r>
+      <w:r>
+        <w:rPr>
+          <w:b/>
+          <w:bCs/>
+        </w:rPr>
+        <w:t xml:space="preserve"> </w:t>
+      </w:r>
+      <w:r>
+        <w:rPr>
+          <w:rFonts w:hint="eastAsia"/>
+          <w:b/>
+          <w:bCs/>
+        </w:rPr>
+        <w:t xml:space="preserve">的</w:t>
+      </w:r>
+      <w:r>
+        <w:rPr>
+          <w:b/>
+          <w:bCs/>
+        </w:rPr>
+        <w:t xml:space="preserve"> </w:t>
+      </w:r>
+      <w:r>
+        <w:rPr>
+          <w:rFonts w:hint="eastAsia"/>
+          <w:b/>
+          <w:bCs/>
+        </w:rPr>
+        <w:t xml:space="preserve">B13）</w:t>
+      </w:r>
+      <w:r>
+        <w:rPr>
+          <w:rFonts w:hint="eastAsia"/>
+        </w:rPr>
+        <w:t xml:space="preserve">：把</w:t>
+      </w:r>
+      <w:r>
+        <w:t xml:space="preserve"> 11 </w:t>
+      </w:r>
+      <w:r>
+        <w:rPr>
+          <w:rFonts w:hint="eastAsia"/>
+        </w:rPr>
+        <w:t xml:space="preserve">个角度的声场按”到轴上某点的</w:t>
+      </w:r>
+      <w:r>
+        <w:t xml:space="preserve"> </w:t>
+      </w:r>
+      <w:r>
+        <w:rPr>
+          <w:rFonts w:hint="eastAsia"/>
+        </w:rPr>
+        <w:t xml:space="preserve">传播时间”平移后相加。它只补掉了轴向相位</w:t>
+      </w:r>
+      <w:r>
+        <w:t xml:space="preserve"> </w:t>
+      </w:r>
+      <m:oMath>
+        <m:r>
+          <m:t>z</m:t>
+        </m:r>
+        <m:r>
+          <m:rPr>
+            <m:sty m:val="p"/>
+          </m:rPr>
+          <m:t>cos</m:t>
+        </m:r>
+        <m:r>
+          <m:t>α</m:t>
+        </m:r>
+        <m:r>
+          <m:rPr>
+            <m:sty m:val="p"/>
+          </m:rPr>
+          <m:t>/</m:t>
+        </m:r>
+        <m:r>
+          <m:t>c</m:t>
+        </m:r>
+      </m:oMath>
+      <w:r>
+        <w:rPr>
+          <w:rFonts w:hint="eastAsia"/>
+        </w:rPr>
+        <w:t xml:space="preserve">，横向相位</w:t>
+      </w:r>
+      <w:r>
+        <w:t xml:space="preserve"> </w:t>
+      </w:r>
+      <m:oMath>
+        <m:r>
+          <m:t>x</m:t>
+        </m:r>
+        <m:r>
+          <m:rPr>
+            <m:sty m:val="p"/>
+          </m:rPr>
+          <m:t>sin</m:t>
+        </m:r>
+        <m:r>
+          <m:t>α</m:t>
+        </m:r>
+        <m:r>
+          <m:rPr>
+            <m:sty m:val="p"/>
+          </m:rPr>
+          <m:t>/</m:t>
+        </m:r>
+        <m:r>
+          <m:t>c</m:t>
+        </m:r>
+      </m:oMath>
+      <w:r>
+        <w:t xml:space="preserve"> </w:t>
+      </w:r>
+      <w:r>
+        <w:rPr>
+          <w:rFonts w:hint="eastAsia"/>
+        </w:rPr>
+        <w:t xml:space="preserve">还留着，于是离轴处各角度的脉冲彼此错开、退出叠加，得到一条”看起来像焦斑”的窄条</w:t>
+      </w:r>
+      <w:r>
+        <w:t xml:space="preserve"> </w:t>
+      </w:r>
+      <w:r>
+        <w:rPr>
+          <w:rFonts w:hint="eastAsia"/>
+        </w:rPr>
+        <w:t xml:space="preserve">（宽约</w:t>
+      </w:r>
+      <w:r>
+        <w:t xml:space="preserve"> </w:t>
+      </w:r>
+      <m:oMath>
+        <m:r>
+          <m:t>c</m:t>
+        </m:r>
+        <m:r>
+          <m:t>T</m:t>
+        </m:r>
+        <m:r>
+          <m:rPr>
+            <m:sty m:val="p"/>
+          </m:rPr>
+          <m:t>/</m:t>
+        </m:r>
+        <m:r>
+          <m:rPr>
+            <m:sty m:val="p"/>
+          </m:rPr>
+          <m:t>(</m:t>
+        </m:r>
+        <m:r>
+          <m:t>2</m:t>
+        </m:r>
+        <m:r>
+          <m:rPr>
+            <m:sty m:val="p"/>
+          </m:rPr>
+          <m:t>sin</m:t>
+        </m:r>
+        <m:r>
+          <m:rPr>
+            <m:sty m:val="p"/>
+          </m:rPr>
+          <m:t>Δ</m:t>
+        </m:r>
+        <m:r>
+          <m:t>α</m:t>
+        </m:r>
+        <m:r>
+          <m:rPr>
+            <m:sty m:val="p"/>
+          </m:rPr>
+          <m:t>)</m:t>
+        </m:r>
+        <m:r>
+          <m:rPr>
+            <m:sty m:val="p"/>
+          </m:rPr>
+          <m:t>≈</m:t>
+        </m:r>
+        <m:r>
+          <m:t>1</m:t>
+        </m:r>
+      </m:oMath>
+      <w:r>
+        <w:t xml:space="preserve"> </w:t>
+      </w:r>
+      <w:r>
+        <w:rPr>
+          <w:rFonts w:hint="eastAsia"/>
+        </w:rPr>
+        <w:t xml:space="preserve">mm）。那不是成像里的任何量：真实成像在</w:t>
+      </w:r>
+      <w:r>
+        <w:t xml:space="preserve"> DAS </w:t>
+      </w:r>
+      <w:r>
+        <w:rPr>
+          <w:rFonts w:hint="eastAsia"/>
+        </w:rPr>
+        <w:t xml:space="preserve">里</w:t>
+      </w:r>
+      <w:r>
+        <w:t xml:space="preserve"> </w:t>
+      </w:r>
+      <w:r>
+        <w:rPr>
+          <w:rFonts w:hint="eastAsia"/>
+        </w:rPr>
+        <w:t xml:space="preserve">逐像素补掉</w:t>
+      </w:r>
+      <w:r>
+        <w:t xml:space="preserve"> </w:t>
+      </w:r>
+      <m:oMath>
+        <m:r>
+          <m:rPr>
+            <m:sty m:val="p"/>
+          </m:rPr>
+          <m:t>(</m:t>
+        </m:r>
+        <m:r>
+          <m:t>x</m:t>
+        </m:r>
+        <m:r>
+          <m:rPr>
+            <m:sty m:val="p"/>
+          </m:rPr>
+          <m:t>sin</m:t>
+        </m:r>
+        <m:r>
+          <m:t>α</m:t>
+        </m:r>
+        <m:r>
+          <m:rPr>
+            <m:sty m:val="p"/>
+          </m:rPr>
+          <m:t>+</m:t>
+        </m:r>
+        <m:r>
+          <m:t>z</m:t>
+        </m:r>
+        <m:r>
+          <m:rPr>
+            <m:sty m:val="p"/>
+          </m:rPr>
+          <m:t>cos</m:t>
+        </m:r>
+        <m:r>
+          <m:t>α</m:t>
+        </m:r>
+        <m:r>
+          <m:rPr>
+            <m:sty m:val="p"/>
+          </m:rPr>
+          <m:t>)</m:t>
+        </m:r>
+        <m:r>
+          <m:rPr>
+            <m:sty m:val="p"/>
+          </m:rPr>
+          <m:t>/</m:t>
+        </m:r>
+        <m:r>
+          <m:t>c</m:t>
+        </m:r>
+      </m:oMath>
+      <w:r>
+        <w:rPr>
+          <w:rFonts w:hint="eastAsia"/>
+        </w:rPr>
+        <w:t xml:space="preserve">，加权是幅度相加而不是场的相干相加。</w:t>
       </w:r>
     </w:p>
     <w:bookmarkEnd w:id="17"/>
@@ -4585,7 +5244,7 @@
               <w:rPr>
                 <w:rFonts w:hint="eastAsia"/>
               </w:rPr>
-              <w:t xml:space="preserve">20log10(囊内平均强度</w:t>
+              <w:t xml:space="preserve">10log10(囊内平均强度</w:t>
             </w:r>
             <w:r>
               <w:t xml:space="preserve"> / </w:t>
@@ -4629,7 +5288,31 @@
               <w:t xml:space="preserve">mm，外区</w:t>
             </w:r>
             <w:r>
-              <w:t xml:space="preserve"> 4–6 mm</w:t>
+              <w:t xml:space="preserve"> 4–6 </w:t>
+            </w:r>
+            <w:r>
+              <w:rPr>
+                <w:rFonts w:hint="eastAsia"/>
+              </w:rPr>
+              <w:t xml:space="preserve">mm。强度比取</w:t>
+            </w:r>
+            <w:r>
+              <w:t xml:space="preserve"> </w:t>
+            </w:r>
+            <w:r>
+              <w:rPr>
+                <w:rFonts w:hint="eastAsia"/>
+              </w:rPr>
+              <w:t xml:space="preserve">10log10，与</w:t>
+            </w:r>
+            <w:r>
+              <w:t xml:space="preserve"> 20log10 </w:t>
+            </w:r>
+            <w:r>
+              <w:rPr>
+                <w:rFonts w:hint="eastAsia"/>
+              </w:rPr>
+              <w:t xml:space="preserve">的幅度比等价</w:t>
             </w:r>
           </w:p>
         </w:tc>
@@ -4719,97 +5402,7 @@
           </w:p>
         </w:tc>
       </w:tr>
-      <w:tr>
-        <w:tc>
-          <w:tcPr/>
-          <w:p>
-            <w:pPr>
-              <w:pStyle w:val="Compact"/>
-            </w:pPr>
-            <w:r>
-              <w:rPr>
-                <w:rFonts w:hint="eastAsia"/>
-              </w:rPr>
-              <w:t xml:space="preserve">散斑</w:t>
-            </w:r>
-            <w:r>
-              <w:t xml:space="preserve"> μ/σ</w:t>
-            </w:r>
-          </w:p>
-        </w:tc>
-        <w:tc>
-          <w:tcPr/>
-          <w:p>
-            <w:pPr>
-              <w:pStyle w:val="Compact"/>
-            </w:pPr>
-            <w:r>
-              <w:rPr>
-                <w:rFonts w:hint="eastAsia"/>
-              </w:rPr>
-              <w:t xml:space="preserve">强度与包络各算一个</w:t>
-            </w:r>
-          </w:p>
-        </w:tc>
-        <w:tc>
-          <w:tcPr/>
-          <w:p>
-            <w:pPr>
-              <w:pStyle w:val="Compact"/>
-            </w:pPr>
-            <w:r>
-              <w:rPr>
-                <w:rFonts w:hint="eastAsia"/>
-              </w:rPr>
-              <w:t xml:space="preserve">必须先去掉缓慢亮度趋势，否则即使散斑完全发展也只有</w:t>
-            </w:r>
-            <w:r>
-              <w:t xml:space="preserve"> 0.5</w:t>
-            </w:r>
-          </w:p>
-        </w:tc>
-      </w:tr>
     </w:tbl>
-    <w:p>
-      <w:pPr>
-        <w:pStyle w:val="BodyText"/>
-      </w:pPr>
-      <w:r>
-        <w:rPr>
-          <w:rFonts w:hint="eastAsia"/>
-          <w:b/>
-          <w:bCs/>
-        </w:rPr>
-        <w:t xml:space="preserve">两套理想值别搞混</w:t>
-      </w:r>
-      <w:r>
-        <w:rPr>
-          <w:rFonts w:hint="eastAsia"/>
-        </w:rPr>
-        <w:t xml:space="preserve">：强度服从指数分布，μ/σ</w:t>
-      </w:r>
-      <w:r>
-        <w:t xml:space="preserve"> = </w:t>
-      </w:r>
-      <w:r>
-        <w:rPr>
-          <w:rFonts w:hint="eastAsia"/>
-        </w:rPr>
-        <w:t xml:space="preserve">1.00；包络服从</w:t>
-      </w:r>
-      <w:r>
-        <w:t xml:space="preserve"> </w:t>
-      </w:r>
-      <w:r>
-        <w:rPr>
-          <w:rFonts w:hint="eastAsia"/>
-        </w:rPr>
-        <w:t xml:space="preserve">Rayleigh，μ/σ</w:t>
-      </w:r>
-      <w:r>
-        <w:t xml:space="preserve"> = 1.91。</w:t>
-      </w:r>
-    </w:p>
     <w:p>
       <w:r>
         <w:pict>
@@ -5339,34 +5932,31 @@
               <w:rPr>
                 <w:rFonts w:hint="eastAsia"/>
               </w:rPr>
-              <w:t xml:space="preserve">张声场</w:t>
-            </w:r>
-            <w:r>
-              <w:t xml:space="preserve"> + </w:t>
-            </w:r>
-            <w:r>
-              <w:rPr>
-                <w:rFonts w:hint="eastAsia"/>
-              </w:rPr>
-              <w:t xml:space="preserve">合成场</w:t>
-            </w:r>
-            <w:r>
-              <w:t xml:space="preserve"> + </w:t>
-            </w:r>
-            <w:r>
-              <w:rPr>
-                <w:rFonts w:hint="eastAsia"/>
-              </w:rPr>
-              <w:t xml:space="preserve">聚焦场</w:t>
-            </w:r>
-            <w:r>
-              <w:t xml:space="preserve"> + </w:t>
-            </w:r>
-            <w:r>
-              <w:rPr>
-                <w:rFonts w:hint="eastAsia"/>
-              </w:rPr>
-              <w:t xml:space="preserve">焦点增益</w:t>
+              <w:t xml:space="preserve">个角度的发射峰值声压</w:t>
+            </w:r>
+            <w:r>
+              <w:t xml:space="preserve"> </w:t>
+            </w:r>
+            <w:r>
+              <w:rPr>
+                <w:rStyle w:val="VerbatimChar"/>
+              </w:rPr>
+              <w:t xml:space="preserve">peakAll</w:t>
+            </w:r>
+            <w:r>
+              <w:rPr>
+                <w:rFonts w:hint="eastAsia"/>
+              </w:rPr>
+              <w:t xml:space="preserve">（1</w:t>
+            </w:r>
+            <w:r>
+              <w:t xml:space="preserve"> mm </w:t>
+            </w:r>
+            <w:r>
+              <w:rPr>
+                <w:rFonts w:hint="eastAsia"/>
+              </w:rPr>
+              <w:t xml:space="preserve">网格）</w:t>
             </w:r>
           </w:p>
         </w:tc>
@@ -5388,7 +5978,7 @@
               <w:pStyle w:val="Compact"/>
             </w:pPr>
             <w:r>
-              <w:t xml:space="preserve">make_figures</w:t>
+              <w:t xml:space="preserve">make_figures, make_fig_coverage</w:t>
             </w:r>
           </w:p>
         </w:tc>
@@ -5430,6 +6020,67 @@
             </w:pPr>
             <w:r>
               <w:t xml:space="preserve">stage_analysis</w:t>
+            </w:r>
+          </w:p>
+        </w:tc>
+        <w:tc>
+          <w:tcPr/>
+          <w:p>
+            <w:pPr>
+              <w:pStyle w:val="Compact"/>
+            </w:pPr>
+            <w:r>
+              <w:t xml:space="preserve">make_figures</w:t>
+            </w:r>
+          </w:p>
+        </w:tc>
+      </w:tr>
+      <w:tr>
+        <w:tc>
+          <w:tcPr/>
+          <w:p>
+            <w:pPr>
+              <w:pStyle w:val="Compact"/>
+            </w:pPr>
+            <w:r>
+              <w:rPr>
+                <w:rStyle w:val="VerbatimChar"/>
+              </w:rPr>
+              <w:t xml:space="preserve">data/res/psfmap.mat</w:t>
+            </w:r>
+          </w:p>
+        </w:tc>
+        <w:tc>
+          <w:tcPr/>
+          <w:p>
+            <w:pPr>
+              <w:pStyle w:val="Compact"/>
+            </w:pPr>
+            <w:r>
+              <w:rPr>
+                <w:rFonts w:hint="eastAsia"/>
+              </w:rPr>
+              <w:t xml:space="preserve">成像区域逐点的峰值/宽度/相干因子（图</w:t>
+            </w:r>
+            <w:r>
+              <w:t xml:space="preserve"> </w:t>
+            </w:r>
+            <w:r>
+              <w:rPr>
+                <w:rFonts w:hint="eastAsia"/>
+              </w:rPr>
+              <w:t xml:space="preserve">F5）</w:t>
+            </w:r>
+          </w:p>
+        </w:tc>
+        <w:tc>
+          <w:tcPr/>
+          <w:p>
+            <w:pPr>
+              <w:pStyle w:val="Compact"/>
+            </w:pPr>
+            <w:r>
+              <w:t xml:space="preserve">run_psfmap</w:t>
             </w:r>
           </w:p>
         </w:tc>
@@ -5644,6 +6295,159 @@
           <w:rFonts w:hint="eastAsia"/>
         </w:rPr>
         <w:t xml:space="preserve">想重跑某一次发射，删掉对应文件即可。</w:t>
+      </w:r>
+    </w:p>
+    <w:p>
+      <w:pPr>
+        <w:pStyle w:val="BodyText"/>
+      </w:pPr>
+      <w:r>
+        <w:rPr>
+          <w:rFonts w:hint="eastAsia"/>
+          <w:b/>
+          <w:bCs/>
+        </w:rPr>
+        <w:t xml:space="preserve">但”存在即跳过”有前提</w:t>
+      </w:r>
+      <w:r>
+        <w:rPr>
+          <w:rFonts w:hint="eastAsia"/>
+        </w:rPr>
+        <w:t xml:space="preserve">：跳过只在参数没变时成立。采集前会比对</w:t>
+      </w:r>
+      <w:r>
+        <w:t xml:space="preserve"> </w:t>
+      </w:r>
+      <w:r>
+        <w:rPr>
+          <w:rStyle w:val="VerbatimChar"/>
+        </w:rPr>
+        <w:t xml:space="preserve">data/stamp_acq.mat</w:t>
+      </w:r>
+      <w:r>
+        <w:rPr>
+          <w:rFonts w:hint="eastAsia"/>
+        </w:rPr>
+        <w:t xml:space="preserve">（</w:t>
+      </w:r>
+      <w:r>
+        <w:rPr>
+          <w:rStyle w:val="VerbatimChar"/>
+        </w:rPr>
+        <w:t xml:space="preserve">src/data_stamp.m</w:t>
+      </w:r>
+      <w:r>
+        <w:t xml:space="preserve"> </w:t>
+      </w:r>
+      <w:r>
+        <w:rPr>
+          <w:rFonts w:hint="eastAsia"/>
+        </w:rPr>
+        <w:t xml:space="preserve">给出的</w:t>
+      </w:r>
+      <w:r>
+        <w:t xml:space="preserve"> 35 </w:t>
+      </w:r>
+      <w:r>
+        <w:rPr>
+          <w:rFonts w:hint="eastAsia"/>
+        </w:rPr>
+        <w:t xml:space="preserve">个参数</w:t>
+      </w:r>
+      <w:r>
+        <w:t xml:space="preserve"> + </w:t>
+      </w:r>
+      <w:r>
+        <w:rPr>
+          <w:rFonts w:hint="eastAsia"/>
+        </w:rPr>
+        <w:t xml:space="preserve">采集算法版本）：</w:t>
+      </w:r>
+      <w:r>
+        <w:t xml:space="preserve"> </w:t>
+      </w:r>
+      <w:r>
+        <w:rPr>
+          <w:rFonts w:hint="eastAsia"/>
+        </w:rPr>
+        <w:t xml:space="preserve">一致才续跑；不一致就报错并列出改过的参数，必须用</w:t>
+      </w:r>
+      <w:r>
+        <w:t xml:space="preserve"> </w:t>
+      </w:r>
+      <w:r>
+        <w:rPr>
+          <w:rStyle w:val="VerbatimChar"/>
+        </w:rPr>
+        <w:t xml:space="preserve">run_core('cold')</w:t>
+      </w:r>
+      <w:r>
+        <w:t xml:space="preserve"> </w:t>
+      </w:r>
+      <w:r>
+        <w:rPr>
+          <w:rFonts w:hint="eastAsia"/>
+        </w:rPr>
+        <w:t xml:space="preserve">重算。</w:t>
+      </w:r>
+      <w:r>
+        <w:t xml:space="preserve"> </w:t>
+      </w:r>
+      <w:r>
+        <w:rPr>
+          <w:rFonts w:hint="eastAsia"/>
+        </w:rPr>
+        <w:t xml:space="preserve">因此改</w:t>
+      </w:r>
+      <w:r>
+        <w:t xml:space="preserve"> </w:t>
+      </w:r>
+      <w:r>
+        <w:rPr>
+          <w:rStyle w:val="VerbatimChar"/>
+        </w:rPr>
+        <w:t xml:space="preserve">P.elemPitch</w:t>
+      </w:r>
+      <w:r>
+        <w:t xml:space="preserve">、</w:t>
+      </w:r>
+      <w:r>
+        <w:rPr>
+          <w:rStyle w:val="VerbatimChar"/>
+        </w:rPr>
+        <w:t xml:space="preserve">P.angles</w:t>
+      </w:r>
+      <w:r>
+        <w:t xml:space="preserve">、</w:t>
+      </w:r>
+      <w:r>
+        <w:rPr>
+          <w:rStyle w:val="VerbatimChar"/>
+        </w:rPr>
+        <w:t xml:space="preserve">P.randomSeed</w:t>
+      </w:r>
+      <w:r>
+        <w:t xml:space="preserve"> </w:t>
+      </w:r>
+      <w:r>
+        <w:rPr>
+          <w:rFonts w:hint="eastAsia"/>
+        </w:rPr>
+        <w:t xml:space="preserve">之类的参数后</w:t>
+      </w:r>
+      <w:r>
+        <w:rPr>
+          <w:rFonts w:hint="eastAsia"/>
+          <w:b/>
+          <w:bCs/>
+        </w:rPr>
+        <w:t xml:space="preserve">不会</w:t>
+      </w:r>
+      <w:r>
+        <w:rPr>
+          <w:rFonts w:hint="eastAsia"/>
+        </w:rPr>
+        <w:t xml:space="preserve">把旧数据当成新结果。</w:t>
       </w:r>
     </w:p>
     <w:p>
@@ -5838,7 +6642,7 @@
         <w:t xml:space="preserve">报告里的”横向分辨率</w:t>
       </w:r>
       <w:r>
-        <w:t xml:space="preserve"> 0.92 </w:t>
+        <w:t xml:space="preserve"> 0.99 </w:t>
       </w:r>
       <w:r>
         <w:rPr>
@@ -6186,7 +6990,7 @@
               <w:rPr>
                 <w:rStyle w:val="VerbatimChar"/>
               </w:rPr>
-              <w:t xml:space="preserve">P.angStepDeg</w:t>
+              <w:t xml:space="preserve">P.angleStepDeg</w:t>
             </w:r>
             <w:r>
               <w:t xml:space="preserve"> </w:t>
@@ -6204,7 +7008,7 @@
               <w:rPr>
                 <w:rStyle w:val="VerbatimChar"/>
               </w:rPr>
-              <w:t xml:space="preserve">P.iAng</w:t>
+              <w:t xml:space="preserve">P.angleIndex</w:t>
             </w:r>
             <w:r>
               <w:rPr>
@@ -6216,7 +7020,7 @@
               <w:rPr>
                 <w:rStyle w:val="VerbatimChar"/>
               </w:rPr>
-              <w:t xml:space="preserve">P.subsetN</w:t>
+              <w:t xml:space="preserve">P.compoundCounts</w:t>
             </w:r>
             <w:r>
               <w:t xml:space="preserve"> </w:t>
@@ -6322,21 +7126,21 @@
               <w:rPr>
                 <w:rStyle w:val="VerbatimChar"/>
               </w:rPr>
-              <w:t xml:space="preserve">P.Fnum</w:t>
-            </w:r>
-          </w:p>
-        </w:tc>
-        <w:tc>
-          <w:tcPr/>
-          <w:p>
-            <w:pPr>
-              <w:pStyle w:val="Compact"/>
-            </w:pPr>
-            <w:r>
-              <w:rPr>
-                <w:rFonts w:hint="eastAsia"/>
-              </w:rPr>
-              <w:t xml:space="preserve">要重跑采集（≈45</w:t>
+              <w:t xml:space="preserve">P.fNumber</w:t>
+            </w:r>
+          </w:p>
+        </w:tc>
+        <w:tc>
+          <w:tcPr/>
+          <w:p>
+            <w:pPr>
+              <w:pStyle w:val="Compact"/>
+            </w:pPr>
+            <w:r>
+              <w:rPr>
+                <w:rFonts w:hint="eastAsia"/>
+              </w:rPr>
+              <w:t xml:space="preserve">要重跑采集（≈1</w:t>
             </w:r>
             <w:r>
               <w:t xml:space="preserve"> </w:t>
@@ -6345,7 +7149,7 @@
               <w:rPr>
                 <w:rFonts w:hint="eastAsia"/>
               </w:rPr>
-              <w:t xml:space="preserve">min）</w:t>
+              <w:t xml:space="preserve">h）</w:t>
             </w:r>
           </w:p>
         </w:tc>
@@ -6393,7 +7197,7 @@
               <w:rPr>
                 <w:rStyle w:val="VerbatimChar"/>
               </w:rPr>
-              <w:t xml:space="preserve">P.scatN</w:t>
+              <w:t xml:space="preserve">P.nScatterers</w:t>
             </w:r>
             <w:r>
               <w:t xml:space="preserve">、</w:t>
@@ -6402,7 +7206,7 @@
               <w:rPr>
                 <w:rStyle w:val="VerbatimChar"/>
               </w:rPr>
-              <w:t xml:space="preserve">P.phX/P.phZ</w:t>
+              <w:t xml:space="preserve">P.phantomExtentX/P.phantomExtentZ</w:t>
             </w:r>
           </w:p>
         </w:tc>
@@ -6464,7 +7268,7 @@
               <w:rPr>
                 <w:rStyle w:val="VerbatimChar"/>
               </w:rPr>
-              <w:t xml:space="preserve">P.cystX/P.cystZ/P.cystR</w:t>
+              <w:t xml:space="preserve">P.cystCenterX/P.cystCenterZ/P.cystRadius</w:t>
             </w:r>
           </w:p>
         </w:tc>
@@ -6544,7 +7348,7 @@
               <w:rPr>
                 <w:rStyle w:val="VerbatimChar"/>
               </w:rPr>
-              <w:t xml:space="preserve">P.snrPW30</w:t>
+              <w:t xml:space="preserve">P.pwSnrTargetDB</w:t>
             </w:r>
           </w:p>
         </w:tc>
@@ -6636,7 +7440,7 @@
               <w:rPr>
                 <w:rStyle w:val="VerbatimChar"/>
               </w:rPr>
-              <w:t xml:space="preserve">P.drDB</w:t>
+              <w:t xml:space="preserve">P.displayRangeDB</w:t>
             </w:r>
           </w:p>
         </w:tc>
@@ -7057,7 +7861,7 @@
               <w:rPr>
                 <w:rFonts w:hint="eastAsia"/>
               </w:rPr>
-              <w:t xml:space="preserve">个囊肿（cystX(k)</w:t>
+              <w:t xml:space="preserve">个囊肿（cystCenterX(k)</w:t>
             </w:r>
             <w:r>
               <w:t xml:space="preserve"> </w:t>
@@ -7075,7 +7879,7 @@
               <w:rPr>
                 <w:rFonts w:hint="eastAsia"/>
               </w:rPr>
-              <w:t xml:space="preserve">cystZ(k)）</w:t>
+              <w:t xml:space="preserve">cystCenterZ(k)）</w:t>
             </w:r>
           </w:p>
         </w:tc>
@@ -7123,86 +7927,59 @@
               <w:rPr>
                 <w:rFonts w:hint="eastAsia"/>
               </w:rPr>
-              <w:t xml:space="preserve">散斑</w:t>
-            </w:r>
-            <w:r>
-              <w:t xml:space="preserve"> μ/σ </w:t>
-            </w:r>
-            <w:r>
-              <w:rPr>
-                <w:rFonts w:hint="eastAsia"/>
-              </w:rPr>
-              <w:t xml:space="preserve">只有</w:t>
-            </w:r>
-            <w:r>
-              <w:t xml:space="preserve"> </w:t>
-            </w:r>
-            <w:r>
-              <w:rPr>
-                <w:rFonts w:hint="eastAsia"/>
-              </w:rPr>
-              <w:t xml:space="preserve">0.6，怎么都不像</w:t>
-            </w:r>
-            <w:r>
-              <w:t xml:space="preserve"> Rayleigh</w:t>
-            </w:r>
-          </w:p>
-        </w:tc>
-        <w:tc>
-          <w:tcPr/>
-          <w:p>
-            <w:pPr>
-              <w:pStyle w:val="Compact"/>
-            </w:pPr>
-            <w:r>
-              <w:t xml:space="preserve">10 mm ROI </w:t>
-            </w:r>
-            <w:r>
-              <w:rPr>
-                <w:rFonts w:hint="eastAsia"/>
-              </w:rPr>
-              <w:t xml:space="preserve">跨越了数</w:t>
-            </w:r>
-            <w:r>
-              <w:t xml:space="preserve"> dB </w:t>
-            </w:r>
-            <w:r>
-              <w:rPr>
-                <w:rFonts w:hint="eastAsia"/>
-              </w:rPr>
-              <w:t xml:space="preserve">的亮度趋势（无</w:t>
-            </w:r>
-            <w:r>
-              <w:t xml:space="preserve"> </w:t>
-            </w:r>
-            <w:r>
-              <w:rPr>
-                <w:rFonts w:hint="eastAsia"/>
-              </w:rPr>
-              <w:t xml:space="preserve">TGC）</w:t>
-            </w:r>
-          </w:p>
-        </w:tc>
-        <w:tc>
-          <w:tcPr/>
-          <w:p>
-            <w:pPr>
-              <w:pStyle w:val="Compact"/>
-            </w:pPr>
-            <w:r>
-              <w:rPr>
-                <w:rFonts w:hint="eastAsia"/>
-              </w:rPr>
-              <w:t xml:space="preserve">先除以</w:t>
-            </w:r>
-            <w:r>
-              <w:t xml:space="preserve"> 2 mm </w:t>
-            </w:r>
-            <w:r>
-              <w:rPr>
-                <w:rFonts w:hint="eastAsia"/>
-              </w:rPr>
-              <w:t xml:space="preserve">盒式均值再去统计</w:t>
+              <w:t xml:space="preserve">合成声场里出现一条”窄条焦斑”（已废弃该图）</w:t>
+            </w:r>
+          </w:p>
+        </w:tc>
+        <w:tc>
+          <w:tcPr/>
+          <w:p>
+            <w:pPr>
+              <w:pStyle w:val="Compact"/>
+            </w:pPr>
+            <w:r>
+              <w:rPr>
+                <w:rFonts w:hint="eastAsia"/>
+              </w:rPr>
+              <w:t xml:space="preserve">只补了轴向相位，横向相位</w:t>
+            </w:r>
+            <w:r>
+              <w:t xml:space="preserve"> x·sinα/c </w:t>
+            </w:r>
+            <w:r>
+              <w:rPr>
+                <w:rFonts w:hint="eastAsia"/>
+              </w:rPr>
+              <w:t xml:space="preserve">还留着</w:t>
+            </w:r>
+          </w:p>
+        </w:tc>
+        <w:tc>
+          <w:tcPr/>
+          <w:p>
+            <w:pPr>
+              <w:pStyle w:val="Compact"/>
+            </w:pPr>
+            <w:r>
+              <w:rPr>
+                <w:rFonts w:hint="eastAsia"/>
+              </w:rPr>
+              <w:t xml:space="preserve">该做法已删除，改为逐点成像验证（</w:t>
+            </w:r>
+            <w:r>
+              <w:rPr>
+                <w:rStyle w:val="VerbatimChar"/>
+              </w:rPr>
+              <w:t xml:space="preserve">psf_map.m</w:t>
+            </w:r>
+            <w:r>
+              <w:rPr>
+                <w:rFonts w:hint="eastAsia"/>
+              </w:rPr>
+              <w:t xml:space="preserve">）；见报告归档</w:t>
+            </w:r>
+            <w:r>
+              <w:t xml:space="preserve"> B13</w:t>
             </w:r>
           </w:p>
         </w:tc>
@@ -7218,21 +7995,48 @@
               <w:rPr>
                 <w:rFonts w:hint="eastAsia"/>
               </w:rPr>
-              <w:t xml:space="preserve">合成声场看不到焦斑</w:t>
-            </w:r>
-          </w:p>
-        </w:tc>
-        <w:tc>
-          <w:tcPr/>
-          <w:p>
-            <w:pPr>
-              <w:pStyle w:val="Compact"/>
-            </w:pPr>
-            <w:r>
-              <w:rPr>
-                <w:rFonts w:hint="eastAsia"/>
-              </w:rPr>
-              <w:t xml:space="preserve">用了逐像素延时而不是”到焦点的常数延时”</w:t>
+              <w:t xml:space="preserve">合成声场增益只有</w:t>
+            </w:r>
+            <w:r>
+              <w:t xml:space="preserve"> </w:t>
+            </w:r>
+            <w:r>
+              <w:rPr>
+                <w:rFonts w:hint="eastAsia"/>
+              </w:rPr>
+              <w:t xml:space="preserve">1.6（应为</w:t>
+            </w:r>
+            <w:r>
+              <w:t xml:space="preserve"> </w:t>
+            </w:r>
+            <w:r>
+              <w:rPr>
+                <w:rFonts w:hint="eastAsia"/>
+              </w:rPr>
+              <w:t xml:space="preserve">~11）</w:t>
+            </w:r>
+          </w:p>
+        </w:tc>
+        <w:tc>
+          <w:tcPr/>
+          <w:p>
+            <w:pPr>
+              <w:pStyle w:val="Compact"/>
+            </w:pPr>
+            <w:r>
+              <w:rPr>
+                <w:rFonts w:hint="eastAsia"/>
+              </w:rPr>
+              <w:t xml:space="preserve">每列都读到了第</w:t>
+            </w:r>
+            <w:r>
+              <w:t xml:space="preserve"> 1 </w:t>
+            </w:r>
+            <w:r>
+              <w:rPr>
+                <w:rFonts w:hint="eastAsia"/>
+              </w:rPr>
+              <w:t xml:space="preserve">列（线性索引少了列偏移）</w:t>
             </w:r>
           </w:p>
         </w:tc>
@@ -7246,19 +8050,13 @@
               <w:rPr>
                 <w:rStyle w:val="VerbatimChar"/>
               </w:rPr>
-              <w:t xml:space="preserve">stage_fields.m</w:t>
-            </w:r>
-            <w:r>
-              <w:t xml:space="preserve"> </w:t>
-            </w:r>
-            <w:r>
-              <w:rPr>
-                <w:rFonts w:hint="eastAsia"/>
-              </w:rPr>
-              <w:t xml:space="preserve">用</w:t>
-            </w:r>
-            <w:r>
-              <w:t xml:space="preserve"> tauS = 30mm·cosα/c</w:t>
+              <w:t xml:space="preserve">li = ... + col</w:t>
+            </w:r>
+            <w:r>
+              <w:rPr>
+                <w:rFonts w:hint="eastAsia"/>
+              </w:rPr>
+              <w:t xml:space="preserve">，并注释说明（该段代码随后整体删除）</w:t>
             </w:r>
           </w:p>
         </w:tc>
@@ -7274,68 +8072,110 @@
               <w:rPr>
                 <w:rFonts w:hint="eastAsia"/>
               </w:rPr>
-              <w:t xml:space="preserve">合成声场增益只有</w:t>
-            </w:r>
-            <w:r>
-              <w:t xml:space="preserve"> </w:t>
-            </w:r>
-            <w:r>
-              <w:rPr>
-                <w:rFonts w:hint="eastAsia"/>
-              </w:rPr>
-              <w:t xml:space="preserve">1.6（应为</w:t>
-            </w:r>
-            <w:r>
-              <w:t xml:space="preserve"> </w:t>
-            </w:r>
-            <w:r>
-              <w:rPr>
-                <w:rFonts w:hint="eastAsia"/>
-              </w:rPr>
-              <w:t xml:space="preserve">~11）</w:t>
-            </w:r>
-          </w:p>
-        </w:tc>
-        <w:tc>
-          <w:tcPr/>
-          <w:p>
-            <w:pPr>
-              <w:pStyle w:val="Compact"/>
-            </w:pPr>
-            <w:r>
-              <w:rPr>
-                <w:rFonts w:hint="eastAsia"/>
-              </w:rPr>
-              <w:t xml:space="preserve">每列都读到了第</w:t>
-            </w:r>
-            <w:r>
-              <w:t xml:space="preserve"> 1 </w:t>
-            </w:r>
-            <w:r>
-              <w:rPr>
-                <w:rFonts w:hint="eastAsia"/>
-              </w:rPr>
-              <w:t xml:space="preserve">列（线性索引少了列偏移）</w:t>
-            </w:r>
-          </w:p>
-        </w:tc>
-        <w:tc>
-          <w:tcPr/>
-          <w:p>
-            <w:pPr>
-              <w:pStyle w:val="Compact"/>
-            </w:pPr>
-            <w:r>
-              <w:rPr>
-                <w:rStyle w:val="VerbatimChar"/>
-              </w:rPr>
-              <w:t xml:space="preserve">li = ... + col</w:t>
-            </w:r>
-            <w:r>
-              <w:rPr>
-                <w:rFonts w:hint="eastAsia"/>
-              </w:rPr>
-              <w:t xml:space="preserve">，并注释说明</w:t>
+              <w:t xml:space="preserve">轴向分辨率在</w:t>
+            </w:r>
+            <w:r>
+              <w:t xml:space="preserve"> 0.11–0.23 mm </w:t>
+            </w:r>
+            <w:r>
+              <w:rPr>
+                <w:rFonts w:hint="eastAsia"/>
+              </w:rPr>
+              <w:t xml:space="preserve">之间乱跳</w:t>
+            </w:r>
+          </w:p>
+        </w:tc>
+        <w:tc>
+          <w:tcPr/>
+          <w:p>
+            <w:pPr>
+              <w:pStyle w:val="Compact"/>
+            </w:pPr>
+            <w:r>
+              <w:t xml:space="preserve">0.05 mm </w:t>
+            </w:r>
+            <w:r>
+              <w:rPr>
+                <w:rFonts w:hint="eastAsia"/>
+              </w:rPr>
+              <w:t xml:space="preserve">网格对</w:t>
+            </w:r>
+            <w:r>
+              <w:t xml:space="preserve"> 0.19 mm </w:t>
+            </w:r>
+            <w:r>
+              <w:rPr>
+                <w:rFonts w:hint="eastAsia"/>
+              </w:rPr>
+              <w:t xml:space="preserve">宽的包络太粗（−6</w:t>
+            </w:r>
+            <w:r>
+              <w:t xml:space="preserve"> dB </w:t>
+            </w:r>
+            <w:r>
+              <w:rPr>
+                <w:rFonts w:hint="eastAsia"/>
+              </w:rPr>
+              <w:t xml:space="preserve">以上只有</w:t>
+            </w:r>
+            <w:r>
+              <w:t xml:space="preserve"> 3—4 </w:t>
+            </w:r>
+            <w:r>
+              <w:rPr>
+                <w:rFonts w:hint="eastAsia"/>
+              </w:rPr>
+              <w:t xml:space="preserve">个点）</w:t>
+            </w:r>
+          </w:p>
+        </w:tc>
+        <w:tc>
+          <w:tcPr/>
+          <w:p>
+            <w:pPr>
+              <w:pStyle w:val="Compact"/>
+            </w:pPr>
+            <w:r>
+              <w:rPr>
+                <w:rFonts w:hint="eastAsia"/>
+              </w:rPr>
+              <w:t xml:space="preserve">测量前</w:t>
+            </w:r>
+            <w:r>
+              <w:t xml:space="preserve"> 8 </w:t>
+            </w:r>
+            <w:r>
+              <w:rPr>
+                <w:rFonts w:hint="eastAsia"/>
+              </w:rPr>
+              <w:t xml:space="preserve">倍</w:t>
+            </w:r>
+            <w:r>
+              <w:t xml:space="preserve"> pchip </w:t>
+            </w:r>
+            <w:r>
+              <w:rPr>
+                <w:rFonts w:hint="eastAsia"/>
+              </w:rPr>
+              <w:t xml:space="preserve">上采样；剩下的</w:t>
+            </w:r>
+            <w:r>
+              <w:t xml:space="preserve"> 0.005–0.017 mm </w:t>
+            </w:r>
+            <w:r>
+              <w:rPr>
+                <w:rFonts w:hint="eastAsia"/>
+              </w:rPr>
+              <w:t xml:space="preserve">偏置随深度变化，已计入报告</w:t>
+            </w:r>
+            <w:r>
+              <w:t xml:space="preserve"> 5.5 </w:t>
+            </w:r>
+            <w:r>
+              <w:rPr>
+                <w:rFonts w:hint="eastAsia"/>
+              </w:rPr>
+              <w:t xml:space="preserve">节的读数不确定度</w:t>
             </w:r>
           </w:p>
         </w:tc>
@@ -7348,77 +8188,53 @@
               <w:pStyle w:val="Compact"/>
             </w:pPr>
             <w:r>
-              <w:rPr>
-                <w:rFonts w:hint="eastAsia"/>
-              </w:rPr>
-              <w:t xml:space="preserve">轴向分辨率在</w:t>
-            </w:r>
-            <w:r>
-              <w:t xml:space="preserve"> 0.11–0.23 mm </w:t>
-            </w:r>
-            <w:r>
-              <w:rPr>
-                <w:rFonts w:hint="eastAsia"/>
-              </w:rPr>
-              <w:t xml:space="preserve">之间乱跳</w:t>
-            </w:r>
-          </w:p>
-        </w:tc>
-        <w:tc>
-          <w:tcPr/>
-          <w:p>
-            <w:pPr>
-              <w:pStyle w:val="Compact"/>
-            </w:pPr>
-            <w:r>
-              <w:t xml:space="preserve">0.05 mm </w:t>
-            </w:r>
-            <w:r>
-              <w:rPr>
-                <w:rFonts w:hint="eastAsia"/>
-              </w:rPr>
-              <w:t xml:space="preserve">网格对</w:t>
-            </w:r>
-            <w:r>
-              <w:t xml:space="preserve"> 0.18 mm </w:t>
-            </w:r>
-            <w:r>
-              <w:rPr>
-                <w:rFonts w:hint="eastAsia"/>
-              </w:rPr>
-              <w:t xml:space="preserve">宽的包络太粗</w:t>
-            </w:r>
-          </w:p>
-        </w:tc>
-        <w:tc>
-          <w:tcPr/>
-          <w:p>
-            <w:pPr>
-              <w:pStyle w:val="Compact"/>
-            </w:pPr>
-            <w:r>
-              <w:rPr>
-                <w:rFonts w:hint="eastAsia"/>
-              </w:rPr>
-              <w:t xml:space="preserve">测量前</w:t>
-            </w:r>
-            <w:r>
-              <w:t xml:space="preserve"> 8 </w:t>
-            </w:r>
-            <w:r>
-              <w:rPr>
-                <w:rFonts w:hint="eastAsia"/>
-              </w:rPr>
-              <w:t xml:space="preserve">倍</w:t>
-            </w:r>
-            <w:r>
-              <w:t xml:space="preserve"> pchip </w:t>
-            </w:r>
-            <w:r>
-              <w:rPr>
-                <w:rFonts w:hint="eastAsia"/>
-              </w:rPr>
-              <w:t xml:space="preserve">上采样</w:t>
+              <w:t xml:space="preserve">CNR </w:t>
+            </w:r>
+            <w:r>
+              <w:rPr>
+                <w:rFonts w:hint="eastAsia"/>
+              </w:rPr>
+              <w:t xml:space="preserve">几乎不随方法变化</w:t>
+            </w:r>
+          </w:p>
+        </w:tc>
+        <w:tc>
+          <w:tcPr/>
+          <w:p>
+            <w:pPr>
+              <w:pStyle w:val="Compact"/>
+            </w:pPr>
+            <w:r>
+              <w:rPr>
+                <w:rFonts w:hint="eastAsia"/>
+              </w:rPr>
+              <w:t xml:space="preserve">囊内一黑，CNR</w:t>
+            </w:r>
+            <w:r>
+              <w:t xml:space="preserve"> </w:t>
+            </w:r>
+            <w:r>
+              <w:rPr>
+                <w:rFonts w:hint="eastAsia"/>
+              </w:rPr>
+              <w:t xml:space="preserve">饱和在</w:t>
+            </w:r>
+            <w:r>
+              <w:t xml:space="preserve"> 0.7</w:t>
+            </w:r>
+          </w:p>
+        </w:tc>
+        <w:tc>
+          <w:tcPr/>
+          <w:p>
+            <w:pPr>
+              <w:pStyle w:val="Compact"/>
+            </w:pPr>
+            <w:r>
+              <w:rPr>
+                <w:rFonts w:hint="eastAsia"/>
+              </w:rPr>
+              <w:t xml:space="preserve">报告里说明以对比度为主判据</w:t>
             </w:r>
           </w:p>
         </w:tc>
@@ -7431,27 +8247,13 @@
               <w:pStyle w:val="Compact"/>
             </w:pPr>
             <w:r>
-              <w:t xml:space="preserve">CNR </w:t>
-            </w:r>
-            <w:r>
-              <w:rPr>
-                <w:rFonts w:hint="eastAsia"/>
-              </w:rPr>
-              <w:t xml:space="preserve">几乎不随方法变化</w:t>
-            </w:r>
-          </w:p>
-        </w:tc>
-        <w:tc>
-          <w:tcPr/>
-          <w:p>
-            <w:pPr>
-              <w:pStyle w:val="Compact"/>
-            </w:pPr>
-            <w:r>
-              <w:rPr>
-                <w:rFonts w:hint="eastAsia"/>
-              </w:rPr>
-              <w:t xml:space="preserve">囊内一黑，CNR</w:t>
+              <w:t xml:space="preserve">0° </w:t>
+            </w:r>
+            <w:r>
+              <w:rPr>
+                <w:rFonts w:hint="eastAsia"/>
+              </w:rPr>
+              <w:t xml:space="preserve">那一次的通道数据读不到（F6</w:t>
             </w:r>
             <w:r>
               <w:t xml:space="preserve"> </w:t>
@@ -7460,24 +8262,113 @@
               <w:rPr>
                 <w:rFonts w:hint="eastAsia"/>
               </w:rPr>
-              <w:t xml:space="preserve">饱和在</w:t>
-            </w:r>
-            <w:r>
-              <w:t xml:space="preserve"> 0.7</w:t>
-            </w:r>
-          </w:p>
-        </w:tc>
-        <w:tc>
-          <w:tcPr/>
-          <w:p>
-            <w:pPr>
-              <w:pStyle w:val="Compact"/>
-            </w:pPr>
-            <w:r>
-              <w:rPr>
-                <w:rFonts w:hint="eastAsia"/>
-              </w:rPr>
-              <w:t xml:space="preserve">报告里说明以对比度为主判据</w:t>
+              <w:t xml:space="preserve">报</w:t>
+            </w:r>
+            <w:r>
+              <w:t xml:space="preserve"> </w:t>
+            </w:r>
+            <w:r>
+              <w:rPr>
+                <w:rFonts w:hint="eastAsia"/>
+              </w:rPr>
+              <w:t xml:space="preserve">“无法识别的字段</w:t>
+            </w:r>
+            <w:r>
+              <w:t xml:space="preserve"> ch”</w:t>
+            </w:r>
+            <w:r>
+              <w:rPr>
+                <w:rFonts w:hint="eastAsia"/>
+              </w:rPr>
+              <w:t xml:space="preserve">）</w:t>
+            </w:r>
+          </w:p>
+        </w:tc>
+        <w:tc>
+          <w:tcPr/>
+          <w:p>
+            <w:pPr>
+              <w:pStyle w:val="Compact"/>
+            </w:pPr>
+            <w:r>
+              <w:rPr>
+                <w:rFonts w:hint="eastAsia"/>
+              </w:rPr>
+              <w:t xml:space="preserve">文件下标写死成</w:t>
+            </w:r>
+            <w:r>
+              <w:t xml:space="preserve"> </w:t>
+            </w:r>
+            <w:r>
+              <w:rPr>
+                <w:rFonts w:hint="eastAsia"/>
+              </w:rPr>
+              <w:t xml:space="preserve">36（旧</w:t>
+            </w:r>
+            <w:r>
+              <w:t xml:space="preserve"> 71 </w:t>
+            </w:r>
+            <w:r>
+              <w:rPr>
+                <w:rFonts w:hint="eastAsia"/>
+              </w:rPr>
+              <w:t xml:space="preserve">角度集的</w:t>
+            </w:r>
+            <w:r>
+              <w:t xml:space="preserve"> </w:t>
+            </w:r>
+            <w:r>
+              <w:rPr>
+                <w:rFonts w:hint="eastAsia"/>
+              </w:rPr>
+              <w:t xml:space="preserve">0°）</w:t>
+            </w:r>
+          </w:p>
+        </w:tc>
+        <w:tc>
+          <w:tcPr/>
+          <w:p>
+            <w:pPr>
+              <w:pStyle w:val="Compact"/>
+            </w:pPr>
+            <w:r>
+              <w:rPr>
+                <w:rFonts w:hint="eastAsia"/>
+              </w:rPr>
+              <w:t xml:space="preserve">一律用</w:t>
+            </w:r>
+            <w:r>
+              <w:t xml:space="preserve"> </w:t>
+            </w:r>
+            <w:r>
+              <w:rPr>
+                <w:rStyle w:val="VerbatimChar"/>
+              </w:rPr>
+              <w:t xml:space="preserve">P.zeroAngleIndex</w:t>
+            </w:r>
+            <w:r>
+              <w:rPr>
+                <w:rFonts w:hint="eastAsia"/>
+              </w:rPr>
+              <w:t xml:space="preserve">（11</w:t>
+            </w:r>
+            <w:r>
+              <w:t xml:space="preserve"> </w:t>
+            </w:r>
+            <w:r>
+              <w:rPr>
+                <w:rFonts w:hint="eastAsia"/>
+              </w:rPr>
+              <w:t xml:space="preserve">角度时是</w:t>
+            </w:r>
+            <w:r>
+              <w:t xml:space="preserve"> </w:t>
+            </w:r>
+            <w:r>
+              <w:rPr>
+                <w:rFonts w:hint="eastAsia"/>
+              </w:rPr>
+              <w:t xml:space="preserve">6）</w:t>
             </w:r>
           </w:p>
         </w:tc>
@@ -7490,144 +8381,10 @@
               <w:pStyle w:val="Compact"/>
             </w:pPr>
             <w:r>
-              <w:t xml:space="preserve">0° </w:t>
-            </w:r>
-            <w:r>
-              <w:rPr>
-                <w:rFonts w:hint="eastAsia"/>
-              </w:rPr>
-              <w:t xml:space="preserve">那一次的通道数据读不到（F6</w:t>
-            </w:r>
-            <w:r>
-              <w:t xml:space="preserve"> </w:t>
-            </w:r>
-            <w:r>
-              <w:rPr>
-                <w:rFonts w:hint="eastAsia"/>
-              </w:rPr>
-              <w:t xml:space="preserve">报</w:t>
-            </w:r>
-            <w:r>
-              <w:t xml:space="preserve"> </w:t>
-            </w:r>
-            <w:r>
-              <w:rPr>
-                <w:rFonts w:hint="eastAsia"/>
-              </w:rPr>
-              <w:t xml:space="preserve">“无法识别的字段</w:t>
-            </w:r>
-            <w:r>
-              <w:t xml:space="preserve"> ch”</w:t>
-            </w:r>
-            <w:r>
-              <w:rPr>
-                <w:rFonts w:hint="eastAsia"/>
-              </w:rPr>
-              <w:t xml:space="preserve">）</w:t>
-            </w:r>
-          </w:p>
-        </w:tc>
-        <w:tc>
-          <w:tcPr/>
-          <w:p>
-            <w:pPr>
-              <w:pStyle w:val="Compact"/>
-            </w:pPr>
-            <w:r>
-              <w:rPr>
-                <w:rFonts w:hint="eastAsia"/>
-              </w:rPr>
-              <w:t xml:space="preserve">文件下标写死成</w:t>
-            </w:r>
-            <w:r>
-              <w:t xml:space="preserve"> </w:t>
-            </w:r>
-            <w:r>
-              <w:rPr>
-                <w:rFonts w:hint="eastAsia"/>
-              </w:rPr>
-              <w:t xml:space="preserve">36（旧</w:t>
-            </w:r>
-            <w:r>
-              <w:t xml:space="preserve"> 71 </w:t>
-            </w:r>
-            <w:r>
-              <w:rPr>
-                <w:rFonts w:hint="eastAsia"/>
-              </w:rPr>
-              <w:t xml:space="preserve">角度集的</w:t>
-            </w:r>
-            <w:r>
-              <w:t xml:space="preserve"> </w:t>
-            </w:r>
-            <w:r>
-              <w:rPr>
-                <w:rFonts w:hint="eastAsia"/>
-              </w:rPr>
-              <w:t xml:space="preserve">0°）</w:t>
-            </w:r>
-          </w:p>
-        </w:tc>
-        <w:tc>
-          <w:tcPr/>
-          <w:p>
-            <w:pPr>
-              <w:pStyle w:val="Compact"/>
-            </w:pPr>
-            <w:r>
-              <w:rPr>
-                <w:rFonts w:hint="eastAsia"/>
-              </w:rPr>
-              <w:t xml:space="preserve">一律用</w:t>
-            </w:r>
-            <w:r>
-              <w:t xml:space="preserve"> </w:t>
-            </w:r>
-            <w:r>
-              <w:rPr>
-                <w:rStyle w:val="VerbatimChar"/>
-              </w:rPr>
-              <w:t xml:space="preserve">P.iZero</w:t>
-            </w:r>
-            <w:r>
-              <w:rPr>
-                <w:rFonts w:hint="eastAsia"/>
-              </w:rPr>
-              <w:t xml:space="preserve">（11</w:t>
-            </w:r>
-            <w:r>
-              <w:t xml:space="preserve"> </w:t>
-            </w:r>
-            <w:r>
-              <w:rPr>
-                <w:rFonts w:hint="eastAsia"/>
-              </w:rPr>
-              <w:t xml:space="preserve">角度时是</w:t>
-            </w:r>
-            <w:r>
-              <w:t xml:space="preserve"> </w:t>
-            </w:r>
-            <w:r>
-              <w:rPr>
-                <w:rFonts w:hint="eastAsia"/>
-              </w:rPr>
-              <w:t xml:space="preserve">6）</w:t>
-            </w:r>
-          </w:p>
-        </w:tc>
-      </w:tr>
-      <w:tr>
-        <w:tc>
-          <w:tcPr/>
-          <w:p>
-            <w:pPr>
-              <w:pStyle w:val="Compact"/>
-            </w:pPr>
-            <w:r>
-              <w:rPr>
-                <w:rFonts w:hint="eastAsia"/>
-              </w:rPr>
-              <w:t xml:space="preserve">合成场的焦点落在</w:t>
+              <w:rPr>
+                <w:rFonts w:hint="eastAsia"/>
+              </w:rPr>
+              <w:t xml:space="preserve">合成场的峰值落在</w:t>
             </w:r>
             <w:r>
               <w:t xml:space="preserve"> 27 mm </w:t>
@@ -7639,50 +8396,41 @@
               <w:t xml:space="preserve">而不是</w:t>
             </w:r>
             <w:r>
-              <w:t xml:space="preserve"> 30 mm</w:t>
-            </w:r>
-          </w:p>
-        </w:tc>
-        <w:tc>
-          <w:tcPr/>
-          <w:p>
-            <w:pPr>
-              <w:pStyle w:val="Compact"/>
-            </w:pPr>
-            <w:r>
-              <w:t xml:space="preserve">±10° </w:t>
-            </w:r>
-            <w:r>
-              <w:rPr>
-                <w:rFonts w:hint="eastAsia"/>
-              </w:rPr>
-              <w:t xml:space="preserve">的合成孔径等效</w:t>
-            </w:r>
-            <w:r>
-              <w:t xml:space="preserve"> </w:t>
-            </w:r>
-            <w:r>
-              <w:rPr>
-                <w:rFonts w:hint="eastAsia"/>
-              </w:rPr>
-              <w:t xml:space="preserve">F≈2.9、焦深约</w:t>
-            </w:r>
-            <w:r>
-              <w:t xml:space="preserve"> 20 mm</w:t>
-            </w:r>
-          </w:p>
-        </w:tc>
-        <w:tc>
-          <w:tcPr/>
-          <w:p>
-            <w:pPr>
-              <w:pStyle w:val="Compact"/>
-            </w:pPr>
-            <w:r>
-              <w:rPr>
-                <w:rFonts w:hint="eastAsia"/>
-              </w:rPr>
-              <w:t xml:space="preserve">报告</w:t>
+              <w:t xml:space="preserve"> 30 </w:t>
+            </w:r>
+            <w:r>
+              <w:rPr>
+                <w:rFonts w:hint="eastAsia"/>
+              </w:rPr>
+              <w:t xml:space="preserve">mm（该图已废弃）</w:t>
+            </w:r>
+          </w:p>
+        </w:tc>
+        <w:tc>
+          <w:tcPr/>
+          <w:p>
+            <w:pPr>
+              <w:pStyle w:val="Compact"/>
+            </w:pPr>
+            <w:r>
+              <w:rPr>
+                <w:rFonts w:hint="eastAsia"/>
+              </w:rPr>
+              <w:t xml:space="preserve">那本来就是”只补一半延时”的残差，峰值位置没有物理意义</w:t>
+            </w:r>
+          </w:p>
+        </w:tc>
+        <w:tc>
+          <w:tcPr/>
+          <w:p>
+            <w:pPr>
+              <w:pStyle w:val="Compact"/>
+            </w:pPr>
+            <w:r>
+              <w:rPr>
+                <w:rFonts w:hint="eastAsia"/>
+              </w:rPr>
+              <w:t xml:space="preserve">改为逐点成像；报告</w:t>
             </w:r>
             <w:r>
               <w:t xml:space="preserve"> 5.3 </w:t>
@@ -7691,7 +8439,10 @@
               <w:rPr>
                 <w:rFonts w:hint="eastAsia"/>
               </w:rPr>
-              <w:t xml:space="preserve">说明：焦区被拉长，不是对齐错误</w:t>
+              <w:t xml:space="preserve">与归档</w:t>
+            </w:r>
+            <w:r>
+              <w:t xml:space="preserve"> B13</w:t>
             </w:r>
           </w:p>
         </w:tc>
@@ -8043,7 +8794,7 @@
               <w:rPr>
                 <w:rFonts w:hint="eastAsia"/>
               </w:rPr>
-              <w:t xml:space="preserve">0.92，散斑约</w:t>
+              <w:t xml:space="preserve">0.98–0.99，散斑约</w:t>
             </w:r>
             <w:r>
               <w:t xml:space="preserve"> 0.25</w:t>
@@ -8232,7 +8983,7 @@
         <w:rPr>
           <w:rStyle w:val="VerbatimChar"/>
         </w:rPr>
-        <w:t xml:space="preserve"> 5 </w:t>
+        <w:t xml:space="preserve"> 2 </w:t>
       </w:r>
       <w:r>
         <w:rPr>
@@ -8280,20 +9031,46 @@
           <w:rStyle w:val="VerbatimChar"/>
           <w:rFonts w:hint="eastAsia"/>
         </w:rPr>
-        <w:t xml:space="preserve">核心实验（约</w:t>
-      </w:r>
-      <w:r>
-        <w:rPr>
-          <w:rStyle w:val="VerbatimChar"/>
-        </w:rPr>
-        <w:t xml:space="preserve"> 45 </w:t>
-      </w:r>
-      <w:r>
-        <w:rPr>
-          <w:rStyle w:val="VerbatimChar"/>
-          <w:rFonts w:hint="eastAsia"/>
-        </w:rPr>
-        <w:t xml:space="preserve">分钟）</w:t>
+        <w:t xml:space="preserve">核心实验（冷启动约</w:t>
+      </w:r>
+      <w:r>
+        <w:rPr>
+          <w:rStyle w:val="VerbatimChar"/>
+        </w:rPr>
+        <w:t xml:space="preserve"> 50 </w:t>
+      </w:r>
+      <w:r>
+        <w:rPr>
+          <w:rStyle w:val="VerbatimChar"/>
+          <w:rFonts w:hint="eastAsia"/>
+        </w:rPr>
+        <w:t xml:space="preserve">min，负载重时</w:t>
+      </w:r>
+      <w:r>
+        <w:rPr>
+          <w:rStyle w:val="VerbatimChar"/>
+        </w:rPr>
+        <w:t xml:space="preserve"> ~95 </w:t>
+      </w:r>
+      <w:r>
+        <w:rPr>
+          <w:rStyle w:val="VerbatimChar"/>
+          <w:rFonts w:hint="eastAsia"/>
+        </w:rPr>
+        <w:t xml:space="preserve">min；数据已在时约</w:t>
+      </w:r>
+      <w:r>
+        <w:rPr>
+          <w:rStyle w:val="VerbatimChar"/>
+        </w:rPr>
+        <w:t xml:space="preserve"> 10 </w:t>
+      </w:r>
+      <w:r>
+        <w:rPr>
+          <w:rStyle w:val="VerbatimChar"/>
+          <w:rFonts w:hint="eastAsia"/>
+        </w:rPr>
+        <w:t xml:space="preserve">s，采集全部跳过）</w:t>
       </w:r>
       <w:r>
         <w:br/>
@@ -8431,12 +9208,37 @@
         <w:br/>
       </w:r>
       <w:r>
+        <w:rPr>
+          <w:rStyle w:val="VerbatimChar"/>
+        </w:rPr>
+        <w:t xml:space="preserve">% </w:t>
+      </w:r>
+      <w:r>
+        <w:rPr>
+          <w:rStyle w:val="VerbatimChar"/>
+          <w:rFonts w:hint="eastAsia"/>
+        </w:rPr>
+        <w:t xml:space="preserve">改了影响采集的参数后必须冷启动（否则会报“参数不一致”）：</w:t>
+      </w:r>
+      <w:r>
         <w:br/>
       </w:r>
       <w:r>
         <w:rPr>
           <w:rStyle w:val="VerbatimChar"/>
         </w:rPr>
+        <w:t xml:space="preserve">% run_core('cold')</w:t>
+      </w:r>
+      <w:r>
+        <w:br/>
+      </w:r>
+      <w:r>
+        <w:br/>
+      </w:r>
+      <w:r>
+        <w:rPr>
+          <w:rStyle w:val="VerbatimChar"/>
+        </w:rPr>
         <w:t xml:space="preserve">% 3) </w:t>
       </w:r>
       <w:r>
@@ -8444,20 +9246,100 @@
           <w:rStyle w:val="VerbatimChar"/>
           <w:rFonts w:hint="eastAsia"/>
         </w:rPr>
-        <w:t xml:space="preserve">收尾（约</w:t>
-      </w:r>
-      <w:r>
-        <w:rPr>
-          <w:rStyle w:val="VerbatimChar"/>
-        </w:rPr>
-        <w:t xml:space="preserve"> 10 </w:t>
-      </w:r>
-      <w:r>
-        <w:rPr>
-          <w:rStyle w:val="VerbatimChar"/>
-          <w:rFonts w:hint="eastAsia"/>
-        </w:rPr>
-        <w:t xml:space="preserve">分钟，若</w:t>
+        <w:t xml:space="preserve">收尾：声场</w:t>
+      </w:r>
+      <w:r>
+        <w:rPr>
+          <w:rStyle w:val="VerbatimChar"/>
+        </w:rPr>
+        <w:t xml:space="preserve"> + </w:t>
+      </w:r>
+      <w:r>
+        <w:rPr>
+          <w:rStyle w:val="VerbatimChar"/>
+          <w:rFonts w:hint="eastAsia"/>
+        </w:rPr>
+        <w:t xml:space="preserve">指标</w:t>
+      </w:r>
+      <w:r>
+        <w:rPr>
+          <w:rStyle w:val="VerbatimChar"/>
+        </w:rPr>
+        <w:t xml:space="preserve"> + </w:t>
+      </w:r>
+      <w:r>
+        <w:rPr>
+          <w:rStyle w:val="VerbatimChar"/>
+          <w:rFonts w:hint="eastAsia"/>
+        </w:rPr>
+        <w:t xml:space="preserve">逐点成像</w:t>
+      </w:r>
+      <w:r>
+        <w:rPr>
+          <w:rStyle w:val="VerbatimChar"/>
+        </w:rPr>
+        <w:t xml:space="preserve"> + </w:t>
+      </w:r>
+      <w:r>
+        <w:rPr>
+          <w:rStyle w:val="VerbatimChar"/>
+          <w:rFonts w:hint="eastAsia"/>
+        </w:rPr>
+        <w:t xml:space="preserve">图</w:t>
+      </w:r>
+      <w:r>
+        <w:rPr>
+          <w:rStyle w:val="VerbatimChar"/>
+        </w:rPr>
+        <w:t xml:space="preserve"> F1–F14 + </w:t>
+      </w:r>
+      <w:r>
+        <w:rPr>
+          <w:rStyle w:val="VerbatimChar"/>
+          <w:rFonts w:hint="eastAsia"/>
+        </w:rPr>
+        <w:t xml:space="preserve">表（约</w:t>
+      </w:r>
+      <w:r>
+        <w:rPr>
+          <w:rStyle w:val="VerbatimChar"/>
+        </w:rPr>
+        <w:t xml:space="preserve"> 1 </w:t>
+      </w:r>
+      <w:r>
+        <w:rPr>
+          <w:rStyle w:val="VerbatimChar"/>
+          <w:rFonts w:hint="eastAsia"/>
+        </w:rPr>
+        <w:t xml:space="preserve">min，不碰采集）</w:t>
+      </w:r>
+      <w:r>
+        <w:br/>
+      </w:r>
+      <w:r>
+        <w:rPr>
+          <w:rStyle w:val="VerbatimChar"/>
+        </w:rPr>
+        <w:t xml:space="preserve">run_refresh</w:t>
+      </w:r>
+      <w:r>
+        <w:br/>
+      </w:r>
+      <w:r>
+        <w:br/>
+      </w:r>
+      <w:r>
+        <w:rPr>
+          <w:rStyle w:val="VerbatimChar"/>
+        </w:rPr>
+        <w:t xml:space="preserve">% </w:t>
+      </w:r>
+      <w:r>
+        <w:rPr>
+          <w:rStyle w:val="VerbatimChar"/>
+          <w:rFonts w:hint="eastAsia"/>
+        </w:rPr>
+        <w:t xml:space="preserve">若</w:t>
       </w:r>
       <w:r>
         <w:rPr>
@@ -8470,7 +9352,33 @@
           <w:rStyle w:val="VerbatimChar"/>
           <w:rFonts w:hint="eastAsia"/>
         </w:rPr>
-        <w:t xml:space="preserve">已跑完可只跑这一步）</w:t>
+        <w:t xml:space="preserve">在</w:t>
+      </w:r>
+      <w:r>
+        <w:rPr>
+          <w:rStyle w:val="VerbatimChar"/>
+        </w:rPr>
+        <w:t xml:space="preserve"> P1 </w:t>
+      </w:r>
+      <w:r>
+        <w:rPr>
+          <w:rStyle w:val="VerbatimChar"/>
+          <w:rFonts w:hint="eastAsia"/>
+        </w:rPr>
+        <w:t xml:space="preserve">之后中断（REM/噪声还没采），改用下面这条，约</w:t>
+      </w:r>
+      <w:r>
+        <w:rPr>
+          <w:rStyle w:val="VerbatimChar"/>
+        </w:rPr>
+        <w:t xml:space="preserve"> 7 </w:t>
+      </w:r>
+      <w:r>
+        <w:rPr>
+          <w:rStyle w:val="VerbatimChar"/>
+          <w:rFonts w:hint="eastAsia"/>
+        </w:rPr>
+        <w:t xml:space="preserve">min：</w:t>
       </w:r>
       <w:r>
         <w:br/>
@@ -8479,53 +9387,243 @@
         <w:rPr>
           <w:rStyle w:val="VerbatimChar"/>
         </w:rPr>
-        <w:t xml:space="preserve">run_tail</w:t>
-      </w:r>
-      <w:r>
-        <w:br/>
-      </w:r>
-      <w:r>
-        <w:br/>
-      </w:r>
-      <w:r>
-        <w:rPr>
-          <w:rStyle w:val="VerbatimChar"/>
-        </w:rPr>
-        <w:t xml:space="preserve">% 4) </w:t>
-      </w:r>
-      <w:r>
-        <w:rPr>
-          <w:rStyle w:val="VerbatimChar"/>
-          <w:rFonts w:hint="eastAsia"/>
-        </w:rPr>
-        <w:t xml:space="preserve">出图出表（约</w:t>
-      </w:r>
-      <w:r>
-        <w:rPr>
-          <w:rStyle w:val="VerbatimChar"/>
-        </w:rPr>
-        <w:t xml:space="preserve"> 1 </w:t>
-      </w:r>
-      <w:r>
-        <w:rPr>
-          <w:rStyle w:val="VerbatimChar"/>
-          <w:rFonts w:hint="eastAsia"/>
-        </w:rPr>
-        <w:t xml:space="preserve">分钟）</w:t>
-      </w:r>
-      <w:r>
-        <w:br/>
-      </w:r>
-      <w:r>
-        <w:rPr>
-          <w:rStyle w:val="VerbatimChar"/>
-        </w:rPr>
-        <w:t xml:space="preserve">run_refresh</w:t>
+        <w:t xml:space="preserve">% run_tail; make_fig_pointtargets</w:t>
       </w:r>
     </w:p>
     <w:p>
       <w:pPr>
         <w:pStyle w:val="FirstParagraph"/>
+      </w:pPr>
+      <w:r>
+        <w:rPr>
+          <w:rStyle w:val="VerbatimChar"/>
+        </w:rPr>
+        <w:t xml:space="preserve">run_refresh</w:t>
+      </w:r>
+      <w:r>
+        <w:t xml:space="preserve"> </w:t>
+      </w:r>
+      <w:r>
+        <w:rPr>
+          <w:rFonts w:hint="eastAsia"/>
+        </w:rPr>
+        <w:t xml:space="preserve">不碰采集，重算声场+指标+逐点成像并直接产出</w:t>
+      </w:r>
+      <w:r>
+        <w:t xml:space="preserve"> F1–F14 </w:t>
+      </w:r>
+      <w:r>
+        <w:rPr>
+          <w:rFonts w:hint="eastAsia"/>
+        </w:rPr>
+        <w:t xml:space="preserve">与表（约</w:t>
+      </w:r>
+      <w:r>
+        <w:t xml:space="preserve"> 1 </w:t>
+      </w:r>
+      <w:r>
+        <w:rPr>
+          <w:rFonts w:hint="eastAsia"/>
+        </w:rPr>
+        <w:t xml:space="preserve">min，其中逐点成像</w:t>
+      </w:r>
+      <w:r>
+        <w:t xml:space="preserve"> 35 </w:t>
+      </w:r>
+      <w:r>
+        <w:rPr>
+          <w:rFonts w:hint="eastAsia"/>
+        </w:rPr>
+        <w:t xml:space="preserve">s）。</w:t>
+      </w:r>
+      <w:r>
+        <w:rPr>
+          <w:rFonts w:hint="eastAsia"/>
+          <w:b/>
+          <w:bCs/>
+        </w:rPr>
+        <w:t xml:space="preserve">日常复现只需要</w:t>
+      </w:r>
+      <w:r>
+        <w:rPr>
+          <w:b/>
+          <w:bCs/>
+        </w:rPr>
+        <w:t xml:space="preserve"> </w:t>
+      </w:r>
+      <w:r>
+        <w:rPr>
+          <w:rStyle w:val="VerbatimChar"/>
+          <w:b/>
+          <w:bCs/>
+        </w:rPr>
+        <w:t xml:space="preserve">run_core</w:t>
+      </w:r>
+      <w:r>
+        <w:rPr>
+          <w:b/>
+          <w:bCs/>
+        </w:rPr>
+        <w:t xml:space="preserve"> </w:t>
+      </w:r>
+      <w:r>
+        <w:rPr>
+          <w:b/>
+          <w:bCs/>
+        </w:rPr>
+        <w:t xml:space="preserve">+</w:t>
+      </w:r>
+      <w:r>
+        <w:rPr>
+          <w:b/>
+          <w:bCs/>
+        </w:rPr>
+        <w:t xml:space="preserve"> </w:t>
+      </w:r>
+      <w:r>
+        <w:rPr>
+          <w:rStyle w:val="VerbatimChar"/>
+          <w:b/>
+          <w:bCs/>
+        </w:rPr>
+        <w:t xml:space="preserve">run_refresh</w:t>
+      </w:r>
+      <w:r>
+        <w:rPr>
+          <w:b/>
+          <w:bCs/>
+        </w:rPr>
+        <w:t xml:space="preserve"> </w:t>
+      </w:r>
+      <w:r>
+        <w:rPr>
+          <w:rFonts w:hint="eastAsia"/>
+          <w:b/>
+          <w:bCs/>
+        </w:rPr>
+        <w:t xml:space="preserve">两步</w:t>
+      </w:r>
+      <w:r>
+        <w:rPr>
+          <w:rFonts w:hint="eastAsia"/>
+        </w:rPr>
+        <w:t xml:space="preserve">；</w:t>
+      </w:r>
+      <w:r>
+        <w:rPr>
+          <w:rStyle w:val="VerbatimChar"/>
+        </w:rPr>
+        <w:t xml:space="preserve">run_tail</w:t>
+      </w:r>
+      <w:r>
+        <w:t xml:space="preserve"> </w:t>
+      </w:r>
+      <w:r>
+        <w:rPr>
+          <w:rFonts w:hint="eastAsia"/>
+        </w:rPr>
+        <w:t xml:space="preserve">只在</w:t>
+      </w:r>
+      <w:r>
+        <w:t xml:space="preserve"> </w:t>
+      </w:r>
+      <w:r>
+        <w:rPr>
+          <w:rStyle w:val="VerbatimChar"/>
+        </w:rPr>
+        <w:t xml:space="preserve">run_core</w:t>
+      </w:r>
+      <w:r>
+        <w:t xml:space="preserve"> </w:t>
+      </w:r>
+      <w:r>
+        <w:rPr>
+          <w:rFonts w:hint="eastAsia"/>
+        </w:rPr>
+        <w:t xml:space="preserve">于</w:t>
+      </w:r>
+      <w:r>
+        <w:t xml:space="preserve"> P1 </w:t>
+      </w:r>
+      <w:r>
+        <w:rPr>
+          <w:rFonts w:hint="eastAsia"/>
+        </w:rPr>
+        <w:t xml:space="preserve">之后中断时才用（它比</w:t>
+      </w:r>
+      <w:r>
+        <w:t xml:space="preserve"> </w:t>
+      </w:r>
+      <w:r>
+        <w:rPr>
+          <w:rStyle w:val="VerbatimChar"/>
+        </w:rPr>
+        <w:t xml:space="preserve">run_refresh</w:t>
+      </w:r>
+      <w:r>
+        <w:t xml:space="preserve"> </w:t>
+      </w:r>
+      <w:r>
+        <w:rPr>
+          <w:rFonts w:hint="eastAsia"/>
+        </w:rPr>
+        <w:t xml:space="preserve">多一层“缺什么采什么”的</w:t>
+      </w:r>
+      <w:r>
+        <w:t xml:space="preserve"> </w:t>
+      </w:r>
+      <w:r>
+        <w:rPr>
+          <w:rFonts w:hint="eastAsia"/>
+        </w:rPr>
+        <w:t xml:space="preserve">REM/噪声采集；F13</w:t>
+      </w:r>
+      <w:r>
+        <w:t xml:space="preserve"> </w:t>
+      </w:r>
+      <w:r>
+        <w:rPr>
+          <w:rFonts w:hint="eastAsia"/>
+        </w:rPr>
+        <w:t xml:space="preserve">由</w:t>
+      </w:r>
+      <w:r>
+        <w:t xml:space="preserve"> </w:t>
+      </w:r>
+      <w:r>
+        <w:rPr>
+          <w:rStyle w:val="VerbatimChar"/>
+        </w:rPr>
+        <w:t xml:space="preserve">make_fig_pointtargets</w:t>
+      </w:r>
+      <w:r>
+        <w:t xml:space="preserve"> </w:t>
+      </w:r>
+      <w:r>
+        <w:rPr>
+          <w:rFonts w:hint="eastAsia"/>
+        </w:rPr>
+        <w:t xml:space="preserve">单独出，</w:t>
+      </w:r>
+      <w:r>
+        <w:rPr>
+          <w:rStyle w:val="VerbatimChar"/>
+        </w:rPr>
+        <w:t xml:space="preserve">run_refresh</w:t>
+      </w:r>
+      <w:r>
+        <w:t xml:space="preserve"> </w:t>
+      </w:r>
+      <w:r>
+        <w:rPr>
+          <w:rFonts w:hint="eastAsia"/>
+        </w:rPr>
+        <w:t xml:space="preserve">里已经调过）。</w:t>
+      </w:r>
+    </w:p>
+    <w:p>
+      <w:pPr>
+        <w:pStyle w:val="BodyText"/>
       </w:pPr>
       <w:r>
         <w:rPr>
@@ -8767,7 +9865,52 @@
               <w:pStyle w:val="Compact"/>
             </w:pPr>
             <w:r>
-              <w:t xml:space="preserve">≈10 s</w:t>
+              <w:t xml:space="preserve">≈4 s</w:t>
+            </w:r>
+          </w:p>
+        </w:tc>
+      </w:tr>
+      <w:tr>
+        <w:tc>
+          <w:tcPr/>
+          <w:p>
+            <w:pPr>
+              <w:pStyle w:val="Compact"/>
+            </w:pPr>
+            <w:r>
+              <w:rPr>
+                <w:rFonts w:hint="eastAsia"/>
+              </w:rPr>
+              <w:t xml:space="preserve">逐点成像（165</w:t>
+            </w:r>
+            <w:r>
+              <w:t xml:space="preserve"> </w:t>
+            </w:r>
+            <w:r>
+              <w:rPr>
+                <w:rFonts w:hint="eastAsia"/>
+              </w:rPr>
+              <w:t xml:space="preserve">个网格点</w:t>
+            </w:r>
+            <w:r>
+              <w:t xml:space="preserve"> × 11 </w:t>
+            </w:r>
+            <w:r>
+              <w:rPr>
+                <w:rFonts w:hint="eastAsia"/>
+              </w:rPr>
+              <w:t xml:space="preserve">角度）</w:t>
+            </w:r>
+          </w:p>
+        </w:tc>
+        <w:tc>
+          <w:tcPr/>
+          <w:p>
+            <w:pPr>
+              <w:pStyle w:val="Compact"/>
+            </w:pPr>
+            <w:r>
+              <w:t xml:space="preserve">≈35 s</w:t>
             </w:r>
           </w:p>
         </w:tc>
@@ -8826,7 +9969,8 @@
     <w:tbl>
       <w:tblPr>
         <w:tblStyle w:val="Table"/>
-        <w:tblW w:type="auto" w:w="0"/>
+        <w:tblW w:type="pct" w:w="5000"/>
+        <w:tblLayout w:type="fixed"/>
         <w:tblLook w:firstRow="1" w:lastRow="0" w:firstColumn="0" w:lastColumn="0" w:noHBand="0" w:noVBand="0" w:val="0020"/>
       </w:tblPr>
       <w:tblGrid>
@@ -8923,7 +10067,47 @@
               <w:rPr>
                 <w:rFonts w:hint="eastAsia"/>
               </w:rPr>
-              <w:t xml:space="preserve">结果、讨论、结论（本项目的正式产出）</w:t>
+              <w:t xml:space="preserve">目的、方法、参数、过程、结果（本项目的正式产出）</w:t>
+            </w:r>
+          </w:p>
+        </w:tc>
+      </w:tr>
+      <w:tr>
+        <w:tc>
+          <w:tcPr/>
+          <w:p>
+            <w:pPr>
+              <w:pStyle w:val="Compact"/>
+            </w:pPr>
+            <w:r>
+              <w:rPr>
+                <w:rStyle w:val="VerbatimChar"/>
+                <w:rFonts w:hint="eastAsia"/>
+              </w:rPr>
+              <w:t xml:space="preserve">docs/实验报告_讨论与附录.md</w:t>
+            </w:r>
+          </w:p>
+        </w:tc>
+        <w:tc>
+          <w:tcPr/>
+          <w:p>
+            <w:pPr>
+              <w:pStyle w:val="Compact"/>
+            </w:pPr>
+            <w:r>
+              <w:rPr>
+                <w:rFonts w:hint="eastAsia"/>
+              </w:rPr>
+              <w:t xml:space="preserve">报告的讨论、结论、复现附录与</w:t>
+            </w:r>
+            <w:r>
+              <w:t xml:space="preserve"> B1–B14 </w:t>
+            </w:r>
+            <w:r>
+              <w:rPr>
+                <w:rFonts w:hint="eastAsia"/>
+              </w:rPr>
+              <w:t xml:space="preserve">修订记录（正文精简后移出）</w:t>
             </w:r>
           </w:p>
         </w:tc>

</xml_diff>